<commit_message>
docs(fase2): completar evidencias academicas y sistema
</commit_message>
<xml_diff>
--- a/Fase 2/Evidencias Proyecto (version Agil)/Documento 01- Product Vision.docx
+++ b/Fase 2/Evidencias Proyecto (version Agil)/Documento 01- Product Vision.docx
@@ -127,7 +127,7 @@
                         <w:sz w:val="80"/>
                         <w:szCs w:val="80"/>
                       </w:rPr>
-                      <w:t xml:space="preserve">Propuesta de Proyecto       y </w:t>
+                      <w:t xml:space="preserve"/>
                     </w:r>
                     <w:r>
                       <w:rPr>
@@ -135,7 +135,7 @@
                         <w:sz w:val="80"/>
                         <w:szCs w:val="80"/>
                       </w:rPr>
-                      <w:t>Especificación de Requisitos de Software</w:t>
+                      <w:t>Product Vision</w:t>
                     </w:r>
                   </w:p>
                 </w:tc>
@@ -201,7 +201,7 @@
                         <w:szCs w:val="44"/>
                         <w:lang w:val="es-AR"/>
                       </w:rPr>
-                      <w:t>[Insertar Nombre de Proyecto]</w:t>
+                      <w:t>Terreno Conectado</w:t>
                     </w:r>
                   </w:p>
                 </w:tc>
@@ -284,7 +284,7 @@
                     <w:i/>
                     <w:color w:val="FF0000"/>
                   </w:rPr>
-                  <w:t>01</w:t>
+                  <w:t>02</w:t>
                 </w:r>
                 <w:r>
                   <w:rPr>
@@ -344,7 +344,7 @@
                         <w:bCs/>
                         <w:color w:val="FF0000"/>
                       </w:rPr>
-                      <w:t>[Seleccionar fecha]</w:t>
+                      <w:t>16 de octubre de 2026</w:t>
                     </w:r>
                   </w:p>
                 </w:tc>
@@ -408,7 +408,7 @@
                         <w:color w:val="FF0000"/>
                         <w:lang w:val="es-AR"/>
                       </w:rPr>
-                      <w:t>Planificación y</w:t>
+                      <w:t>Fase 2. Evidencia de proyecto ágil.</w:t>
                     </w:r>
                     <w:r>
                       <w:rPr>
@@ -416,7 +416,7 @@
                         <w:color w:val="FF0000"/>
                         <w:lang w:val="es-AR"/>
                       </w:rPr>
-                      <w:t xml:space="preserve"> Especificación de Requisitos según estándar</w:t>
+                      <w:t xml:space="preserve"/>
                     </w:r>
                     <w:r>
                       <w:rPr>
@@ -424,7 +424,7 @@
                         <w:color w:val="FF0000"/>
                         <w:lang w:val="es-AR"/>
                       </w:rPr>
-                      <w:t>es;</w:t>
+                      <w:t/>
                     </w:r>
                     <w:r>
                       <w:rPr>
@@ -432,7 +432,7 @@
                         <w:color w:val="FF0000"/>
                         <w:lang w:val="es-AR"/>
                       </w:rPr>
-                      <w:t xml:space="preserve"> IEEE 830</w:t>
+                      <w:t xml:space="preserve"/>
                     </w:r>
                     <w:r>
                       <w:rPr>
@@ -440,7 +440,7 @@
                         <w:color w:val="FF0000"/>
                         <w:lang w:val="es-AR"/>
                       </w:rPr>
-                      <w:t>, ISO9000 y PMI</w:t>
+                      <w:t/>
                     </w:r>
                     <w:r>
                       <w:rPr>
@@ -448,7 +448,7 @@
                         <w:color w:val="FF0000"/>
                         <w:lang w:val="es-AR"/>
                       </w:rPr>
-                      <w:t>.</w:t>
+                      <w:t/>
                     </w:r>
                   </w:p>
                 </w:tc>
@@ -483,1083 +483,89 @@
     </w:sdt>
     <w:p>
       <w:pPr>
-        <w:spacing w:after="0" w:line="240" w:lineRule="auto"/>
-        <w:jc w:val="both"/>
-        <w:rPr>
-          <w:rFonts w:cstheme="minorHAnsi"/>
-          <w:sz w:val="32"/>
-        </w:rPr>
-      </w:pPr>
+        <w:pStyle w:val="Ttulo1"/>
+      </w:pPr>
+      <w:r>
+        <w:t>Contenido</w:t>
+      </w:r>
     </w:p>
     <w:p>
-      <w:pPr>
-        <w:spacing w:after="0"/>
-        <w:jc w:val="both"/>
-        <w:rPr>
-          <w:rFonts w:eastAsiaTheme="majorEastAsia" w:cstheme="minorHAnsi"/>
-          <w:b/>
-          <w:bCs/>
-          <w:color w:val="365F91" w:themeColor="accent1" w:themeShade="BF"/>
-          <w:sz w:val="28"/>
-          <w:szCs w:val="28"/>
-        </w:rPr>
-      </w:pPr>
-    </w:p>
-    <w:sdt>
-      <w:sdtPr>
-        <w:rPr>
-          <w:rFonts w:asciiTheme="minorHAnsi" w:eastAsiaTheme="minorHAnsi" w:hAnsiTheme="minorHAnsi" w:cstheme="minorHAnsi"/>
-          <w:b w:val="0"/>
-          <w:bCs w:val="0"/>
-          <w:color w:val="auto"/>
-          <w:sz w:val="22"/>
-          <w:szCs w:val="22"/>
-          <w:lang w:val="es-AR"/>
-        </w:rPr>
-        <w:id w:val="1371383"/>
-        <w:docPartObj>
-          <w:docPartGallery w:val="Table of Contents"/>
-          <w:docPartUnique/>
-        </w:docPartObj>
-      </w:sdtPr>
-      <w:sdtContent>
-        <w:p>
-          <w:pPr>
-            <w:pStyle w:val="TtuloTDC"/>
-            <w:jc w:val="both"/>
-            <w:rPr>
-              <w:rFonts w:asciiTheme="minorHAnsi" w:hAnsiTheme="minorHAnsi" w:cstheme="minorHAnsi"/>
-            </w:rPr>
-          </w:pPr>
-          <w:r>
-            <w:rPr>
-              <w:rFonts w:asciiTheme="minorHAnsi" w:hAnsiTheme="minorHAnsi" w:cstheme="minorHAnsi"/>
-            </w:rPr>
-            <w:t>Contenido</w:t>
-          </w:r>
-        </w:p>
-        <w:p>
-          <w:pPr>
-            <w:pStyle w:val="TDC1"/>
-            <w:tabs>
-              <w:tab w:val="left" w:pos="440"/>
-              <w:tab w:val="right" w:leader="dot" w:pos="8828"/>
-            </w:tabs>
-            <w:rPr>
-              <w:rFonts w:eastAsiaTheme="minorEastAsia"/>
-              <w:b w:val="0"/>
-              <w:bCs w:val="0"/>
-              <w:caps w:val="0"/>
-              <w:noProof/>
-              <w:kern w:val="2"/>
-              <w:sz w:val="24"/>
-              <w:szCs w:val="24"/>
-              <w:lang w:val="es-CL" w:eastAsia="es-MX"/>
-              <w14:ligatures w14:val="standardContextual"/>
-            </w:rPr>
-          </w:pPr>
-          <w:r>
-            <w:rPr>
-              <w:rFonts w:cstheme="minorHAnsi"/>
-              <w:i/>
-              <w:iCs/>
-              <w:lang w:val="es-ES"/>
-            </w:rPr>
-            <w:fldChar w:fldCharType="begin"/>
-          </w:r>
-          <w:r>
-            <w:rPr>
-              <w:rFonts w:cstheme="minorHAnsi"/>
-              <w:lang w:val="es-ES"/>
-            </w:rPr>
-            <w:instrText xml:space="preserve"> TOC \o "1-3" \h \z \u </w:instrText>
-          </w:r>
-          <w:r>
-            <w:rPr>
-              <w:rFonts w:cstheme="minorHAnsi"/>
-              <w:i/>
-              <w:iCs/>
-              <w:lang w:val="es-ES"/>
-            </w:rPr>
-            <w:fldChar w:fldCharType="separate"/>
-          </w:r>
-          <w:hyperlink w:anchor="_Toc241503854" w:history="1">
-            <w:r>
-              <w:rPr>
-                <w:rStyle w:val="Hipervnculo"/>
-                <w:rFonts w:eastAsia="Times New Roman" w:cstheme="minorHAnsi"/>
-                <w:noProof/>
-                <w:kern w:val="32"/>
-              </w:rPr>
-              <w:t>2</w:t>
-            </w:r>
-            <w:r>
-              <w:rPr>
-                <w:rFonts w:eastAsiaTheme="minorEastAsia"/>
-                <w:b w:val="0"/>
-                <w:bCs w:val="0"/>
-                <w:caps w:val="0"/>
-                <w:noProof/>
-                <w:kern w:val="2"/>
-                <w:sz w:val="24"/>
-                <w:szCs w:val="24"/>
-                <w:lang w:val="es-CL" w:eastAsia="es-MX"/>
-                <w14:ligatures w14:val="standardContextual"/>
-              </w:rPr>
-              <w:tab/>
-            </w:r>
-            <w:r>
-              <w:rPr>
-                <w:rStyle w:val="Hipervnculo"/>
-                <w:rFonts w:eastAsia="Times New Roman" w:cstheme="minorHAnsi"/>
-                <w:noProof/>
-                <w:kern w:val="32"/>
-              </w:rPr>
-              <w:t>Ficha del documento</w:t>
-            </w:r>
-            <w:r>
-              <w:rPr>
-                <w:noProof/>
-                <w:webHidden/>
-              </w:rPr>
-              <w:tab/>
-            </w:r>
-            <w:r>
-              <w:rPr>
-                <w:noProof/>
-                <w:webHidden/>
-              </w:rPr>
-              <w:fldChar w:fldCharType="begin"/>
-            </w:r>
-            <w:r>
-              <w:rPr>
-                <w:noProof/>
-                <w:webHidden/>
-              </w:rPr>
-              <w:instrText xml:space="preserve"> PAGEREF _Toc241503854 \h </w:instrText>
-            </w:r>
-            <w:r>
-              <w:rPr>
-                <w:noProof/>
-                <w:webHidden/>
-              </w:rPr>
-            </w:r>
-            <w:r>
-              <w:rPr>
-                <w:noProof/>
-                <w:webHidden/>
-              </w:rPr>
-              <w:fldChar w:fldCharType="separate"/>
-            </w:r>
-            <w:r>
-              <w:rPr>
-                <w:noProof/>
-                <w:webHidden/>
-              </w:rPr>
-              <w:t>2</w:t>
-            </w:r>
-            <w:r>
-              <w:rPr>
-                <w:noProof/>
-                <w:webHidden/>
-              </w:rPr>
-              <w:fldChar w:fldCharType="end"/>
-            </w:r>
-          </w:hyperlink>
-        </w:p>
-        <w:p>
-          <w:pPr>
-            <w:pStyle w:val="TDC1"/>
-            <w:tabs>
-              <w:tab w:val="left" w:pos="440"/>
-              <w:tab w:val="right" w:leader="dot" w:pos="8828"/>
-            </w:tabs>
-            <w:rPr>
-              <w:rFonts w:eastAsiaTheme="minorEastAsia"/>
-              <w:b w:val="0"/>
-              <w:bCs w:val="0"/>
-              <w:caps w:val="0"/>
-              <w:noProof/>
-              <w:kern w:val="2"/>
-              <w:sz w:val="24"/>
-              <w:szCs w:val="24"/>
-              <w:lang w:val="es-CL" w:eastAsia="es-MX"/>
-              <w14:ligatures w14:val="standardContextual"/>
-            </w:rPr>
-          </w:pPr>
-          <w:hyperlink w:anchor="_Toc241503855" w:history="1">
-            <w:r>
-              <w:rPr>
-                <w:rStyle w:val="Hipervnculo"/>
-                <w:noProof/>
-              </w:rPr>
-              <w:t>3</w:t>
-            </w:r>
-            <w:r>
-              <w:rPr>
-                <w:rFonts w:eastAsiaTheme="minorEastAsia"/>
-                <w:b w:val="0"/>
-                <w:bCs w:val="0"/>
-                <w:caps w:val="0"/>
-                <w:noProof/>
-                <w:kern w:val="2"/>
-                <w:sz w:val="24"/>
-                <w:szCs w:val="24"/>
-                <w:lang w:val="es-CL" w:eastAsia="es-MX"/>
-                <w14:ligatures w14:val="standardContextual"/>
-              </w:rPr>
-              <w:tab/>
-            </w:r>
-            <w:r>
-              <w:rPr>
-                <w:rStyle w:val="Hipervnculo"/>
-                <w:noProof/>
-              </w:rPr>
-              <w:t>Integrantes:</w:t>
-            </w:r>
-            <w:r>
-              <w:rPr>
-                <w:noProof/>
-                <w:webHidden/>
-              </w:rPr>
-              <w:tab/>
-            </w:r>
-            <w:r>
-              <w:rPr>
-                <w:noProof/>
-                <w:webHidden/>
-              </w:rPr>
-              <w:fldChar w:fldCharType="begin"/>
-            </w:r>
-            <w:r>
-              <w:rPr>
-                <w:noProof/>
-                <w:webHidden/>
-              </w:rPr>
-              <w:instrText xml:space="preserve"> PAGEREF _Toc241503855 \h </w:instrText>
-            </w:r>
-            <w:r>
-              <w:rPr>
-                <w:noProof/>
-                <w:webHidden/>
-              </w:rPr>
-            </w:r>
-            <w:r>
-              <w:rPr>
-                <w:noProof/>
-                <w:webHidden/>
-              </w:rPr>
-              <w:fldChar w:fldCharType="separate"/>
-            </w:r>
-            <w:r>
-              <w:rPr>
-                <w:noProof/>
-                <w:webHidden/>
-              </w:rPr>
-              <w:t>2</w:t>
-            </w:r>
-            <w:r>
-              <w:rPr>
-                <w:noProof/>
-                <w:webHidden/>
-              </w:rPr>
-              <w:fldChar w:fldCharType="end"/>
-            </w:r>
-          </w:hyperlink>
-        </w:p>
-        <w:p>
-          <w:pPr>
-            <w:pStyle w:val="TDC1"/>
-            <w:tabs>
-              <w:tab w:val="left" w:pos="440"/>
-              <w:tab w:val="right" w:leader="dot" w:pos="8828"/>
-            </w:tabs>
-            <w:rPr>
-              <w:rFonts w:eastAsiaTheme="minorEastAsia"/>
-              <w:b w:val="0"/>
-              <w:bCs w:val="0"/>
-              <w:caps w:val="0"/>
-              <w:noProof/>
-              <w:kern w:val="2"/>
-              <w:sz w:val="24"/>
-              <w:szCs w:val="24"/>
-              <w:lang w:val="es-CL" w:eastAsia="es-MX"/>
-              <w14:ligatures w14:val="standardContextual"/>
-            </w:rPr>
-          </w:pPr>
-          <w:hyperlink w:anchor="_Toc241503856" w:history="1">
-            <w:r>
-              <w:rPr>
-                <w:rStyle w:val="Hipervnculo"/>
-                <w:rFonts w:cstheme="minorHAnsi"/>
-                <w:noProof/>
-              </w:rPr>
-              <w:t>4</w:t>
-            </w:r>
-            <w:r>
-              <w:rPr>
-                <w:rFonts w:eastAsiaTheme="minorEastAsia"/>
-                <w:b w:val="0"/>
-                <w:bCs w:val="0"/>
-                <w:caps w:val="0"/>
-                <w:noProof/>
-                <w:kern w:val="2"/>
-                <w:sz w:val="24"/>
-                <w:szCs w:val="24"/>
-                <w:lang w:val="es-CL" w:eastAsia="es-MX"/>
-                <w14:ligatures w14:val="standardContextual"/>
-              </w:rPr>
-              <w:tab/>
-            </w:r>
-            <w:r>
-              <w:rPr>
-                <w:rStyle w:val="Hipervnculo"/>
-                <w:rFonts w:cstheme="minorHAnsi"/>
-                <w:noProof/>
-              </w:rPr>
-              <w:t>Producto Vision</w:t>
-            </w:r>
-            <w:r>
-              <w:rPr>
-                <w:noProof/>
-                <w:webHidden/>
-              </w:rPr>
-              <w:tab/>
-            </w:r>
-            <w:r>
-              <w:rPr>
-                <w:noProof/>
-                <w:webHidden/>
-              </w:rPr>
-              <w:fldChar w:fldCharType="begin"/>
-            </w:r>
-            <w:r>
-              <w:rPr>
-                <w:noProof/>
-                <w:webHidden/>
-              </w:rPr>
-              <w:instrText xml:space="preserve"> PAGEREF _Toc241503856 \h </w:instrText>
-            </w:r>
-            <w:r>
-              <w:rPr>
-                <w:noProof/>
-                <w:webHidden/>
-              </w:rPr>
-            </w:r>
-            <w:r>
-              <w:rPr>
-                <w:noProof/>
-                <w:webHidden/>
-              </w:rPr>
-              <w:fldChar w:fldCharType="separate"/>
-            </w:r>
-            <w:r>
-              <w:rPr>
-                <w:noProof/>
-                <w:webHidden/>
-              </w:rPr>
-              <w:t>4</w:t>
-            </w:r>
-            <w:r>
-              <w:rPr>
-                <w:noProof/>
-                <w:webHidden/>
-              </w:rPr>
-              <w:fldChar w:fldCharType="end"/>
-            </w:r>
-          </w:hyperlink>
-        </w:p>
-        <w:p>
-          <w:pPr>
-            <w:pStyle w:val="TDC2"/>
-            <w:tabs>
-              <w:tab w:val="left" w:pos="880"/>
-              <w:tab w:val="right" w:leader="dot" w:pos="8828"/>
-            </w:tabs>
-            <w:rPr>
-              <w:rFonts w:eastAsiaTheme="minorEastAsia"/>
-              <w:smallCaps w:val="0"/>
-              <w:noProof/>
-              <w:kern w:val="2"/>
-              <w:sz w:val="24"/>
-              <w:szCs w:val="24"/>
-              <w:lang w:val="es-CL" w:eastAsia="es-MX"/>
-              <w14:ligatures w14:val="standardContextual"/>
-            </w:rPr>
-          </w:pPr>
-          <w:hyperlink w:anchor="_Toc241503857" w:history="1">
-            <w:r>
-              <w:rPr>
-                <w:rStyle w:val="Hipervnculo"/>
-                <w:rFonts w:cstheme="minorHAnsi"/>
-                <w:noProof/>
-              </w:rPr>
-              <w:t>4.1</w:t>
-            </w:r>
-            <w:r>
-              <w:rPr>
-                <w:rFonts w:eastAsiaTheme="minorEastAsia"/>
-                <w:smallCaps w:val="0"/>
-                <w:noProof/>
-                <w:kern w:val="2"/>
-                <w:sz w:val="24"/>
-                <w:szCs w:val="24"/>
-                <w:lang w:val="es-CL" w:eastAsia="es-MX"/>
-                <w14:ligatures w14:val="standardContextual"/>
-              </w:rPr>
-              <w:tab/>
-            </w:r>
-            <w:r>
-              <w:rPr>
-                <w:rStyle w:val="Hipervnculo"/>
-                <w:rFonts w:cstheme="minorHAnsi"/>
-                <w:noProof/>
-              </w:rPr>
-              <w:t>¿Cuál es el problema?</w:t>
-            </w:r>
-            <w:r>
-              <w:rPr>
-                <w:noProof/>
-                <w:webHidden/>
-              </w:rPr>
-              <w:tab/>
-            </w:r>
-            <w:r>
-              <w:rPr>
-                <w:noProof/>
-                <w:webHidden/>
-              </w:rPr>
-              <w:fldChar w:fldCharType="begin"/>
-            </w:r>
-            <w:r>
-              <w:rPr>
-                <w:noProof/>
-                <w:webHidden/>
-              </w:rPr>
-              <w:instrText xml:space="preserve"> PAGEREF _Toc241503857 \h </w:instrText>
-            </w:r>
-            <w:r>
-              <w:rPr>
-                <w:noProof/>
-                <w:webHidden/>
-              </w:rPr>
-            </w:r>
-            <w:r>
-              <w:rPr>
-                <w:noProof/>
-                <w:webHidden/>
-              </w:rPr>
-              <w:fldChar w:fldCharType="separate"/>
-            </w:r>
-            <w:r>
-              <w:rPr>
-                <w:noProof/>
-                <w:webHidden/>
-              </w:rPr>
-              <w:t>4</w:t>
-            </w:r>
-            <w:r>
-              <w:rPr>
-                <w:noProof/>
-                <w:webHidden/>
-              </w:rPr>
-              <w:fldChar w:fldCharType="end"/>
-            </w:r>
-          </w:hyperlink>
-        </w:p>
-        <w:p>
-          <w:pPr>
-            <w:pStyle w:val="TDC2"/>
-            <w:tabs>
-              <w:tab w:val="left" w:pos="880"/>
-              <w:tab w:val="right" w:leader="dot" w:pos="8828"/>
-            </w:tabs>
-            <w:rPr>
-              <w:rFonts w:eastAsiaTheme="minorEastAsia"/>
-              <w:smallCaps w:val="0"/>
-              <w:noProof/>
-              <w:kern w:val="2"/>
-              <w:sz w:val="24"/>
-              <w:szCs w:val="24"/>
-              <w:lang w:val="es-CL" w:eastAsia="es-MX"/>
-              <w14:ligatures w14:val="standardContextual"/>
-            </w:rPr>
-          </w:pPr>
-          <w:hyperlink w:anchor="_Toc241503858" w:history="1">
-            <w:r>
-              <w:rPr>
-                <w:rStyle w:val="Hipervnculo"/>
-                <w:noProof/>
-              </w:rPr>
-              <w:t>4.2</w:t>
-            </w:r>
-            <w:r>
-              <w:rPr>
-                <w:rFonts w:eastAsiaTheme="minorEastAsia"/>
-                <w:smallCaps w:val="0"/>
-                <w:noProof/>
-                <w:kern w:val="2"/>
-                <w:sz w:val="24"/>
-                <w:szCs w:val="24"/>
-                <w:lang w:val="es-CL" w:eastAsia="es-MX"/>
-                <w14:ligatures w14:val="standardContextual"/>
-              </w:rPr>
-              <w:tab/>
-            </w:r>
-            <w:r>
-              <w:rPr>
-                <w:rStyle w:val="Hipervnculo"/>
-                <w:noProof/>
-              </w:rPr>
-              <w:t>Usuarios</w:t>
-            </w:r>
-            <w:r>
-              <w:rPr>
-                <w:noProof/>
-                <w:webHidden/>
-              </w:rPr>
-              <w:tab/>
-            </w:r>
-            <w:r>
-              <w:rPr>
-                <w:noProof/>
-                <w:webHidden/>
-              </w:rPr>
-              <w:fldChar w:fldCharType="begin"/>
-            </w:r>
-            <w:r>
-              <w:rPr>
-                <w:noProof/>
-                <w:webHidden/>
-              </w:rPr>
-              <w:instrText xml:space="preserve"> PAGEREF _Toc241503858 \h </w:instrText>
-            </w:r>
-            <w:r>
-              <w:rPr>
-                <w:noProof/>
-                <w:webHidden/>
-              </w:rPr>
-            </w:r>
-            <w:r>
-              <w:rPr>
-                <w:noProof/>
-                <w:webHidden/>
-              </w:rPr>
-              <w:fldChar w:fldCharType="separate"/>
-            </w:r>
-            <w:r>
-              <w:rPr>
-                <w:noProof/>
-                <w:webHidden/>
-              </w:rPr>
-              <w:t>4</w:t>
-            </w:r>
-            <w:r>
-              <w:rPr>
-                <w:noProof/>
-                <w:webHidden/>
-              </w:rPr>
-              <w:fldChar w:fldCharType="end"/>
-            </w:r>
-          </w:hyperlink>
-        </w:p>
-        <w:p>
-          <w:pPr>
-            <w:pStyle w:val="TDC3"/>
-            <w:tabs>
-              <w:tab w:val="left" w:pos="1320"/>
-              <w:tab w:val="right" w:leader="dot" w:pos="8828"/>
-            </w:tabs>
-            <w:rPr>
-              <w:rFonts w:eastAsiaTheme="minorEastAsia"/>
-              <w:i w:val="0"/>
-              <w:iCs w:val="0"/>
-              <w:noProof/>
-              <w:kern w:val="2"/>
-              <w:sz w:val="24"/>
-              <w:szCs w:val="24"/>
-              <w:lang w:val="es-CL" w:eastAsia="es-MX"/>
-              <w14:ligatures w14:val="standardContextual"/>
-            </w:rPr>
-          </w:pPr>
-          <w:hyperlink w:anchor="_Toc241503859" w:history="1">
-            <w:r>
-              <w:rPr>
-                <w:rStyle w:val="Hipervnculo"/>
-                <w:noProof/>
-              </w:rPr>
-              <w:t>4.2.1</w:t>
-            </w:r>
-            <w:r>
-              <w:rPr>
-                <w:rFonts w:eastAsiaTheme="minorEastAsia"/>
-                <w:i w:val="0"/>
-                <w:iCs w:val="0"/>
-                <w:noProof/>
-                <w:kern w:val="2"/>
-                <w:sz w:val="24"/>
-                <w:szCs w:val="24"/>
-                <w:lang w:val="es-CL" w:eastAsia="es-MX"/>
-                <w14:ligatures w14:val="standardContextual"/>
-              </w:rPr>
-              <w:tab/>
-            </w:r>
-            <w:r>
-              <w:rPr>
-                <w:rStyle w:val="Hipervnculo"/>
-                <w:noProof/>
-              </w:rPr>
-              <w:t>Usuario 1</w:t>
-            </w:r>
-            <w:r>
-              <w:rPr>
-                <w:noProof/>
-                <w:webHidden/>
-              </w:rPr>
-              <w:tab/>
-            </w:r>
-            <w:r>
-              <w:rPr>
-                <w:noProof/>
-                <w:webHidden/>
-              </w:rPr>
-              <w:fldChar w:fldCharType="begin"/>
-            </w:r>
-            <w:r>
-              <w:rPr>
-                <w:noProof/>
-                <w:webHidden/>
-              </w:rPr>
-              <w:instrText xml:space="preserve"> PAGEREF _Toc241503859 \h </w:instrText>
-            </w:r>
-            <w:r>
-              <w:rPr>
-                <w:noProof/>
-                <w:webHidden/>
-              </w:rPr>
-            </w:r>
-            <w:r>
-              <w:rPr>
-                <w:noProof/>
-                <w:webHidden/>
-              </w:rPr>
-              <w:fldChar w:fldCharType="separate"/>
-            </w:r>
-            <w:r>
-              <w:rPr>
-                <w:noProof/>
-                <w:webHidden/>
-              </w:rPr>
-              <w:t>4</w:t>
-            </w:r>
-            <w:r>
-              <w:rPr>
-                <w:noProof/>
-                <w:webHidden/>
-              </w:rPr>
-              <w:fldChar w:fldCharType="end"/>
-            </w:r>
-          </w:hyperlink>
-        </w:p>
-        <w:p>
-          <w:pPr>
-            <w:pStyle w:val="TDC3"/>
-            <w:tabs>
-              <w:tab w:val="left" w:pos="1320"/>
-              <w:tab w:val="right" w:leader="dot" w:pos="8828"/>
-            </w:tabs>
-            <w:rPr>
-              <w:rFonts w:eastAsiaTheme="minorEastAsia"/>
-              <w:i w:val="0"/>
-              <w:iCs w:val="0"/>
-              <w:noProof/>
-              <w:kern w:val="2"/>
-              <w:sz w:val="24"/>
-              <w:szCs w:val="24"/>
-              <w:lang w:val="es-CL" w:eastAsia="es-MX"/>
-              <w14:ligatures w14:val="standardContextual"/>
-            </w:rPr>
-          </w:pPr>
-          <w:hyperlink w:anchor="_Toc241503860" w:history="1">
-            <w:r>
-              <w:rPr>
-                <w:rStyle w:val="Hipervnculo"/>
-                <w:noProof/>
-              </w:rPr>
-              <w:t>4.2.2</w:t>
-            </w:r>
-            <w:r>
-              <w:rPr>
-                <w:rFonts w:eastAsiaTheme="minorEastAsia"/>
-                <w:i w:val="0"/>
-                <w:iCs w:val="0"/>
-                <w:noProof/>
-                <w:kern w:val="2"/>
-                <w:sz w:val="24"/>
-                <w:szCs w:val="24"/>
-                <w:lang w:val="es-CL" w:eastAsia="es-MX"/>
-                <w14:ligatures w14:val="standardContextual"/>
-              </w:rPr>
-              <w:tab/>
-            </w:r>
-            <w:r>
-              <w:rPr>
-                <w:rStyle w:val="Hipervnculo"/>
-                <w:noProof/>
-              </w:rPr>
-              <w:t>Usuario 1</w:t>
-            </w:r>
-            <w:r>
-              <w:rPr>
-                <w:noProof/>
-                <w:webHidden/>
-              </w:rPr>
-              <w:tab/>
-            </w:r>
-            <w:r>
-              <w:rPr>
-                <w:noProof/>
-                <w:webHidden/>
-              </w:rPr>
-              <w:fldChar w:fldCharType="begin"/>
-            </w:r>
-            <w:r>
-              <w:rPr>
-                <w:noProof/>
-                <w:webHidden/>
-              </w:rPr>
-              <w:instrText xml:space="preserve"> PAGEREF _Toc241503860 \h </w:instrText>
-            </w:r>
-            <w:r>
-              <w:rPr>
-                <w:noProof/>
-                <w:webHidden/>
-              </w:rPr>
-            </w:r>
-            <w:r>
-              <w:rPr>
-                <w:noProof/>
-                <w:webHidden/>
-              </w:rPr>
-              <w:fldChar w:fldCharType="separate"/>
-            </w:r>
-            <w:r>
-              <w:rPr>
-                <w:noProof/>
-                <w:webHidden/>
-              </w:rPr>
-              <w:t>4</w:t>
-            </w:r>
-            <w:r>
-              <w:rPr>
-                <w:noProof/>
-                <w:webHidden/>
-              </w:rPr>
-              <w:fldChar w:fldCharType="end"/>
-            </w:r>
-          </w:hyperlink>
-        </w:p>
-        <w:p>
-          <w:pPr>
-            <w:pStyle w:val="TDC3"/>
-            <w:tabs>
-              <w:tab w:val="left" w:pos="1320"/>
-              <w:tab w:val="right" w:leader="dot" w:pos="8828"/>
-            </w:tabs>
-            <w:rPr>
-              <w:rFonts w:eastAsiaTheme="minorEastAsia"/>
-              <w:i w:val="0"/>
-              <w:iCs w:val="0"/>
-              <w:noProof/>
-              <w:kern w:val="2"/>
-              <w:sz w:val="24"/>
-              <w:szCs w:val="24"/>
-              <w:lang w:val="es-CL" w:eastAsia="es-MX"/>
-              <w14:ligatures w14:val="standardContextual"/>
-            </w:rPr>
-          </w:pPr>
-          <w:hyperlink w:anchor="_Toc241503861" w:history="1">
-            <w:r>
-              <w:rPr>
-                <w:rStyle w:val="Hipervnculo"/>
-                <w:noProof/>
-              </w:rPr>
-              <w:t>4.2.3</w:t>
-            </w:r>
-            <w:r>
-              <w:rPr>
-                <w:rFonts w:eastAsiaTheme="minorEastAsia"/>
-                <w:i w:val="0"/>
-                <w:iCs w:val="0"/>
-                <w:noProof/>
-                <w:kern w:val="2"/>
-                <w:sz w:val="24"/>
-                <w:szCs w:val="24"/>
-                <w:lang w:val="es-CL" w:eastAsia="es-MX"/>
-                <w14:ligatures w14:val="standardContextual"/>
-              </w:rPr>
-              <w:tab/>
-            </w:r>
-            <w:r>
-              <w:rPr>
-                <w:rStyle w:val="Hipervnculo"/>
-                <w:noProof/>
-              </w:rPr>
-              <w:t>Usuario 1</w:t>
-            </w:r>
-            <w:r>
-              <w:rPr>
-                <w:noProof/>
-                <w:webHidden/>
-              </w:rPr>
-              <w:tab/>
-            </w:r>
-            <w:r>
-              <w:rPr>
-                <w:noProof/>
-                <w:webHidden/>
-              </w:rPr>
-              <w:fldChar w:fldCharType="begin"/>
-            </w:r>
-            <w:r>
-              <w:rPr>
-                <w:noProof/>
-                <w:webHidden/>
-              </w:rPr>
-              <w:instrText xml:space="preserve"> PAGEREF _Toc241503861 \h </w:instrText>
-            </w:r>
-            <w:r>
-              <w:rPr>
-                <w:noProof/>
-                <w:webHidden/>
-              </w:rPr>
-            </w:r>
-            <w:r>
-              <w:rPr>
-                <w:noProof/>
-                <w:webHidden/>
-              </w:rPr>
-              <w:fldChar w:fldCharType="separate"/>
-            </w:r>
-            <w:r>
-              <w:rPr>
-                <w:noProof/>
-                <w:webHidden/>
-              </w:rPr>
-              <w:t>4</w:t>
-            </w:r>
-            <w:r>
-              <w:rPr>
-                <w:noProof/>
-                <w:webHidden/>
-              </w:rPr>
-              <w:fldChar w:fldCharType="end"/>
-            </w:r>
-          </w:hyperlink>
-        </w:p>
-        <w:p>
-          <w:pPr>
-            <w:pStyle w:val="TDC2"/>
-            <w:tabs>
-              <w:tab w:val="left" w:pos="880"/>
-              <w:tab w:val="right" w:leader="dot" w:pos="8828"/>
-            </w:tabs>
-            <w:rPr>
-              <w:rFonts w:eastAsiaTheme="minorEastAsia"/>
-              <w:smallCaps w:val="0"/>
-              <w:noProof/>
-              <w:kern w:val="2"/>
-              <w:sz w:val="24"/>
-              <w:szCs w:val="24"/>
-              <w:lang w:val="es-CL" w:eastAsia="es-MX"/>
-              <w14:ligatures w14:val="standardContextual"/>
-            </w:rPr>
-          </w:pPr>
-          <w:hyperlink w:anchor="_Toc241503862" w:history="1">
-            <w:r>
-              <w:rPr>
-                <w:rStyle w:val="Hipervnculo"/>
-                <w:noProof/>
-                <w:lang w:val="es-ES" w:eastAsia="es-ES"/>
-              </w:rPr>
-              <w:t>4.3</w:t>
-            </w:r>
-            <w:r>
-              <w:rPr>
-                <w:rFonts w:eastAsiaTheme="minorEastAsia"/>
-                <w:smallCaps w:val="0"/>
-                <w:noProof/>
-                <w:kern w:val="2"/>
-                <w:sz w:val="24"/>
-                <w:szCs w:val="24"/>
-                <w:lang w:val="es-CL" w:eastAsia="es-MX"/>
-                <w14:ligatures w14:val="standardContextual"/>
-              </w:rPr>
-              <w:tab/>
-            </w:r>
-            <w:r>
-              <w:rPr>
-                <w:rStyle w:val="Hipervnculo"/>
-                <w:noProof/>
-                <w:lang w:val="es-ES" w:eastAsia="es-ES"/>
-              </w:rPr>
-              <w:t>Propuesta de Valor</w:t>
-            </w:r>
-            <w:r>
-              <w:rPr>
-                <w:noProof/>
-                <w:webHidden/>
-              </w:rPr>
-              <w:tab/>
-            </w:r>
-            <w:r>
-              <w:rPr>
-                <w:noProof/>
-                <w:webHidden/>
-              </w:rPr>
-              <w:fldChar w:fldCharType="begin"/>
-            </w:r>
-            <w:r>
-              <w:rPr>
-                <w:noProof/>
-                <w:webHidden/>
-              </w:rPr>
-              <w:instrText xml:space="preserve"> PAGEREF _Toc241503862 \h </w:instrText>
-            </w:r>
-            <w:r>
-              <w:rPr>
-                <w:noProof/>
-                <w:webHidden/>
-              </w:rPr>
-            </w:r>
-            <w:r>
-              <w:rPr>
-                <w:noProof/>
-                <w:webHidden/>
-              </w:rPr>
-              <w:fldChar w:fldCharType="separate"/>
-            </w:r>
-            <w:r>
-              <w:rPr>
-                <w:noProof/>
-                <w:webHidden/>
-              </w:rPr>
-              <w:t>4</w:t>
-            </w:r>
-            <w:r>
-              <w:rPr>
-                <w:noProof/>
-                <w:webHidden/>
-              </w:rPr>
-              <w:fldChar w:fldCharType="end"/>
-            </w:r>
-          </w:hyperlink>
-        </w:p>
-        <w:p>
-          <w:pPr>
-            <w:jc w:val="both"/>
-            <w:rPr>
-              <w:rFonts w:cstheme="minorHAnsi"/>
-              <w:lang w:val="es-ES"/>
-            </w:rPr>
-          </w:pPr>
-          <w:r>
-            <w:rPr>
-              <w:rFonts w:cstheme="minorHAnsi"/>
-              <w:lang w:val="es-ES"/>
-            </w:rPr>
-            <w:fldChar w:fldCharType="end"/>
-          </w:r>
-        </w:p>
-      </w:sdtContent>
-    </w:sdt>
-    <w:p>
-      <w:pPr>
-        <w:pStyle w:val="Ttulo1"/>
-        <w:jc w:val="both"/>
-        <w:rPr>
-          <w:rFonts w:asciiTheme="minorHAnsi" w:eastAsia="Times New Roman" w:hAnsiTheme="minorHAnsi" w:cstheme="minorHAnsi"/>
-          <w:kern w:val="32"/>
-        </w:rPr>
-      </w:pPr>
-      <w:bookmarkStart w:id="0" w:name="_Toc33411057"/>
-      <w:bookmarkStart w:id="1" w:name="_Toc241503854"/>
       <w:r>
-        <w:rPr>
-          <w:rFonts w:asciiTheme="minorHAnsi" w:eastAsia="Times New Roman" w:hAnsiTheme="minorHAnsi" w:cstheme="minorHAnsi"/>
-          <w:kern w:val="32"/>
-        </w:rPr>
         <w:t>Ficha del documento</w:t>
       </w:r>
-      <w:bookmarkEnd w:id="0"/>
-      <w:bookmarkEnd w:id="1"/>
     </w:p>
     <w:p>
-      <w:pPr>
-        <w:spacing w:after="0" w:line="240" w:lineRule="auto"/>
-        <w:jc w:val="both"/>
-        <w:rPr>
-          <w:rFonts w:eastAsia="Times New Roman" w:cstheme="minorHAnsi"/>
-          <w:sz w:val="20"/>
-          <w:szCs w:val="24"/>
-          <w:lang w:val="es-ES" w:eastAsia="es-ES"/>
-        </w:rPr>
-      </w:pPr>
+      <w:r>
+        <w:t>Integrantes</w:t>
+      </w:r>
     </w:p>
     <w:p>
-      <w:pPr>
-        <w:spacing w:after="0" w:line="240" w:lineRule="auto"/>
-        <w:jc w:val="both"/>
-        <w:rPr>
-          <w:rFonts w:eastAsia="Times New Roman" w:cstheme="minorHAnsi"/>
-          <w:sz w:val="20"/>
-          <w:szCs w:val="24"/>
-          <w:lang w:val="es-ES" w:eastAsia="es-ES"/>
-        </w:rPr>
-      </w:pPr>
+      <w:r>
+        <w:t>Producto Vision</w:t>
+      </w:r>
+    </w:p>
+    <w:p>
+      <w:r>
+        <w:t>Usuarios</w:t>
+      </w:r>
+    </w:p>
+    <w:p>
+      <w:r>
+        <w:t>Propuesta de Valor</w:t>
+      </w:r>
+    </w:p>
+    <w:p>
+      <w:pPr>
+        <w:pStyle w:val="Ttulo1"/>
+      </w:pPr>
+      <w:r>
+        <w:t>Ficha del documento</w:t>
+      </w:r>
     </w:p>
     <w:tbl>
       <w:tblPr>
-        <w:tblStyle w:val="Tablaconcuadrcula1"/>
-        <w:tblW w:w="0" w:type="auto"/>
-        <w:tblBorders>
-          <w:top w:val="single" w:sz="4" w:space="0" w:color="808080"/>
-          <w:left w:val="single" w:sz="4" w:space="0" w:color="808080"/>
-          <w:bottom w:val="single" w:sz="4" w:space="0" w:color="808080"/>
-          <w:right w:val="single" w:sz="4" w:space="0" w:color="808080"/>
-          <w:insideH w:val="single" w:sz="4" w:space="0" w:color="808080"/>
-          <w:insideV w:val="single" w:sz="4" w:space="0" w:color="808080"/>
-        </w:tblBorders>
-        <w:tblLook w:val="01E0" w:firstRow="1" w:lastRow="1" w:firstColumn="1" w:lastColumn="1" w:noHBand="0" w:noVBand="0"/>
+        <w:tblW w:type="auto" w:w="0"/>
+        <w:tblLayout w:type="fixed"/>
+        <w:tblLook w:firstColumn="1" w:firstRow="1" w:lastColumn="0" w:lastRow="0" w:noHBand="0" w:noVBand="1" w:val="04A0"/>
       </w:tblPr>
       <w:tblGrid>
-        <w:gridCol w:w="1188"/>
-        <w:gridCol w:w="1080"/>
-        <w:gridCol w:w="3060"/>
-        <w:gridCol w:w="3316"/>
+        <w:gridCol w:w="2209"/>
+        <w:gridCol w:w="2209"/>
+        <w:gridCol w:w="2209"/>
+        <w:gridCol w:w="2209"/>
       </w:tblGrid>
       <w:tr>
+        <w:trPr>
+          <w:tblHeader/>
+        </w:trPr>
         <w:tc>
           <w:tcPr>
-            <w:tcW w:w="1188" w:type="dxa"/>
-            <w:shd w:val="clear" w:color="auto" w:fill="E6E6E6"/>
+            <w:tcW w:type="dxa" w:w="2209"/>
+            <w:tcBorders>
+              <w:top w:val="single" w:sz="4" w:color="D9D9D9"/>
+              <w:left w:val="single" w:sz="4" w:color="D9D9D9"/>
+              <w:bottom w:val="single" w:sz="4" w:color="D9D9D9"/>
+              <w:right w:val="single" w:sz="4" w:color="D9D9D9"/>
+            </w:tcBorders>
+            <w:tcMar>
+              <w:top w:w="80" w:type="dxa"/>
+              <w:left w:w="80" w:type="dxa"/>
+              <w:bottom w:w="80" w:type="dxa"/>
+              <w:right w:w="80" w:type="dxa"/>
+            </w:tcMar>
           </w:tcPr>
           <w:p>
             <w:pPr>
-              <w:jc w:val="both"/>
-              <w:rPr>
-                <w:rFonts w:asciiTheme="minorHAnsi" w:hAnsiTheme="minorHAnsi" w:cstheme="minorHAnsi"/>
-                <w:b/>
-                <w:szCs w:val="24"/>
-                <w:lang w:val="es-ES" w:eastAsia="es-ES"/>
-              </w:rPr>
+              <w:keepNext w:val="0"/>
+              <w:keepLines w:val="0"/>
+              <w:spacing w:after="100" w:line="240" w:lineRule="auto"/>
             </w:pPr>
             <w:r>
               <w:rPr>
-                <w:rFonts w:asciiTheme="minorHAnsi" w:hAnsiTheme="minorHAnsi" w:cstheme="minorHAnsi"/>
-                <w:b/>
-                <w:szCs w:val="24"/>
-                <w:lang w:val="es-ES" w:eastAsia="es-ES"/>
+                <w:rFonts w:ascii="Arial" w:hAnsi="Arial"/>
+                <w:b w:val="0"/>
+                <w:color w:val="000000"/>
+                <w:sz w:val="22"/>
               </w:rPr>
               <w:t>Fecha</w:t>
             </w:r>
@@ -1567,25 +573,32 @@
         </w:tc>
         <w:tc>
           <w:tcPr>
-            <w:tcW w:w="1080" w:type="dxa"/>
-            <w:shd w:val="clear" w:color="auto" w:fill="E6E6E6"/>
+            <w:tcW w:type="dxa" w:w="2209"/>
+            <w:tcBorders>
+              <w:top w:val="single" w:sz="4" w:color="D9D9D9"/>
+              <w:left w:val="single" w:sz="4" w:color="D9D9D9"/>
+              <w:bottom w:val="single" w:sz="4" w:color="D9D9D9"/>
+              <w:right w:val="single" w:sz="4" w:color="D9D9D9"/>
+            </w:tcBorders>
+            <w:tcMar>
+              <w:top w:w="80" w:type="dxa"/>
+              <w:left w:w="80" w:type="dxa"/>
+              <w:bottom w:w="80" w:type="dxa"/>
+              <w:right w:w="80" w:type="dxa"/>
+            </w:tcMar>
           </w:tcPr>
           <w:p>
             <w:pPr>
-              <w:jc w:val="both"/>
-              <w:rPr>
-                <w:rFonts w:asciiTheme="minorHAnsi" w:hAnsiTheme="minorHAnsi" w:cstheme="minorHAnsi"/>
-                <w:b/>
-                <w:szCs w:val="24"/>
-                <w:lang w:val="es-ES" w:eastAsia="es-ES"/>
-              </w:rPr>
+              <w:keepNext w:val="0"/>
+              <w:keepLines w:val="0"/>
+              <w:spacing w:after="100" w:line="240" w:lineRule="auto"/>
             </w:pPr>
             <w:r>
               <w:rPr>
-                <w:rFonts w:asciiTheme="minorHAnsi" w:hAnsiTheme="minorHAnsi" w:cstheme="minorHAnsi"/>
-                <w:b/>
-                <w:szCs w:val="24"/>
-                <w:lang w:val="es-ES" w:eastAsia="es-ES"/>
+                <w:rFonts w:ascii="Arial" w:hAnsi="Arial"/>
+                <w:b w:val="0"/>
+                <w:color w:val="000000"/>
+                <w:sz w:val="22"/>
               </w:rPr>
               <w:t>Revisión</w:t>
             </w:r>
@@ -1593,51 +606,65 @@
         </w:tc>
         <w:tc>
           <w:tcPr>
-            <w:tcW w:w="3060" w:type="dxa"/>
-            <w:shd w:val="clear" w:color="auto" w:fill="E6E6E6"/>
+            <w:tcW w:type="dxa" w:w="2209"/>
+            <w:tcBorders>
+              <w:top w:val="single" w:sz="4" w:color="D9D9D9"/>
+              <w:left w:val="single" w:sz="4" w:color="D9D9D9"/>
+              <w:bottom w:val="single" w:sz="4" w:color="D9D9D9"/>
+              <w:right w:val="single" w:sz="4" w:color="D9D9D9"/>
+            </w:tcBorders>
+            <w:tcMar>
+              <w:top w:w="80" w:type="dxa"/>
+              <w:left w:w="80" w:type="dxa"/>
+              <w:bottom w:w="80" w:type="dxa"/>
+              <w:right w:w="80" w:type="dxa"/>
+            </w:tcMar>
           </w:tcPr>
           <w:p>
             <w:pPr>
-              <w:jc w:val="both"/>
-              <w:rPr>
-                <w:rFonts w:asciiTheme="minorHAnsi" w:hAnsiTheme="minorHAnsi" w:cstheme="minorHAnsi"/>
-                <w:b/>
-                <w:szCs w:val="24"/>
-                <w:lang w:val="es-ES" w:eastAsia="es-ES"/>
-              </w:rPr>
+              <w:keepNext w:val="0"/>
+              <w:keepLines w:val="0"/>
+              <w:spacing w:after="100" w:line="240" w:lineRule="auto"/>
             </w:pPr>
             <w:r>
               <w:rPr>
-                <w:rFonts w:asciiTheme="minorHAnsi" w:hAnsiTheme="minorHAnsi" w:cstheme="minorHAnsi"/>
-                <w:b/>
-                <w:szCs w:val="24"/>
-                <w:lang w:val="es-ES" w:eastAsia="es-ES"/>
+                <w:rFonts w:ascii="Arial" w:hAnsi="Arial"/>
+                <w:b w:val="0"/>
+                <w:color w:val="000000"/>
+                <w:sz w:val="22"/>
               </w:rPr>
-              <w:t>Autor</w:t>
+              <w:t>Autores</w:t>
             </w:r>
           </w:p>
         </w:tc>
         <w:tc>
           <w:tcPr>
-            <w:tcW w:w="3316" w:type="dxa"/>
-            <w:shd w:val="clear" w:color="auto" w:fill="E6E6E6"/>
+            <w:tcW w:type="dxa" w:w="2209"/>
+            <w:tcBorders>
+              <w:top w:val="single" w:sz="4" w:color="D9D9D9"/>
+              <w:left w:val="single" w:sz="4" w:color="D9D9D9"/>
+              <w:bottom w:val="single" w:sz="4" w:color="D9D9D9"/>
+              <w:right w:val="single" w:sz="4" w:color="D9D9D9"/>
+            </w:tcBorders>
+            <w:tcMar>
+              <w:top w:w="80" w:type="dxa"/>
+              <w:left w:w="80" w:type="dxa"/>
+              <w:bottom w:w="80" w:type="dxa"/>
+              <w:right w:w="80" w:type="dxa"/>
+            </w:tcMar>
           </w:tcPr>
           <w:p>
             <w:pPr>
-              <w:jc w:val="both"/>
-              <w:rPr>
-                <w:rFonts w:asciiTheme="minorHAnsi" w:hAnsiTheme="minorHAnsi" w:cstheme="minorHAnsi"/>
-                <w:b/>
-                <w:szCs w:val="24"/>
-                <w:lang w:val="es-ES" w:eastAsia="es-ES"/>
-              </w:rPr>
+              <w:keepNext w:val="0"/>
+              <w:keepLines w:val="0"/>
+              <w:spacing w:after="100" w:line="240" w:lineRule="auto"/>
             </w:pPr>
             <w:r>
               <w:rPr>
-                <w:rFonts w:asciiTheme="minorHAnsi" w:hAnsiTheme="minorHAnsi" w:cstheme="minorHAnsi"/>
-                <w:b/>
-                <w:szCs w:val="24"/>
-                <w:lang w:val="es-ES" w:eastAsia="es-ES"/>
+                <w:rFonts w:ascii="Arial" w:hAnsi="Arial"/>
+                <w:b w:val="0"/>
+                <w:color w:val="000000"/>
+                <w:sz w:val="22"/>
               </w:rPr>
               <w:t>Modificación</w:t>
             </w:r>
@@ -1645,880 +672,407 @@
         </w:tc>
       </w:tr>
       <w:tr>
-        <w:trPr>
-          <w:trHeight w:val="1134"/>
-        </w:trPr>
         <w:tc>
           <w:tcPr>
-            <w:tcW w:w="1188" w:type="dxa"/>
-            <w:vAlign w:val="center"/>
+            <w:tcW w:type="dxa" w:w="2209"/>
+            <w:tcBorders>
+              <w:top w:val="single" w:sz="4" w:color="D9D9D9"/>
+              <w:left w:val="single" w:sz="4" w:color="D9D9D9"/>
+              <w:bottom w:val="single" w:sz="4" w:color="D9D9D9"/>
+              <w:right w:val="single" w:sz="4" w:color="D9D9D9"/>
+            </w:tcBorders>
+            <w:tcMar>
+              <w:top w:w="80" w:type="dxa"/>
+              <w:left w:w="80" w:type="dxa"/>
+              <w:bottom w:w="80" w:type="dxa"/>
+              <w:right w:w="80" w:type="dxa"/>
+            </w:tcMar>
           </w:tcPr>
           <w:p>
             <w:pPr>
-              <w:jc w:val="both"/>
-              <w:rPr>
-                <w:rFonts w:asciiTheme="minorHAnsi" w:hAnsiTheme="minorHAnsi" w:cstheme="minorHAnsi"/>
-                <w:i/>
-                <w:color w:val="FF0000"/>
-                <w:szCs w:val="24"/>
-                <w:lang w:val="es-ES" w:eastAsia="es-ES"/>
-              </w:rPr>
+              <w:keepNext w:val="0"/>
+              <w:keepLines w:val="0"/>
+              <w:spacing w:after="100" w:line="240" w:lineRule="auto"/>
             </w:pPr>
             <w:r>
               <w:rPr>
-                <w:rFonts w:cstheme="minorHAnsi"/>
-                <w:i/>
-                <w:color w:val="FF0000"/>
-                <w:szCs w:val="24"/>
-                <w:lang w:val="es-ES" w:eastAsia="es-ES"/>
+                <w:rFonts w:ascii="Arial" w:hAnsi="Arial"/>
+                <w:b w:val="0"/>
+                <w:color w:val="000000"/>
+                <w:sz w:val="22"/>
               </w:rPr>
-              <w:fldChar w:fldCharType="begin"/>
-            </w:r>
-            <w:r>
-              <w:rPr>
-                <w:rFonts w:asciiTheme="minorHAnsi" w:hAnsiTheme="minorHAnsi" w:cstheme="minorHAnsi"/>
-                <w:i/>
-                <w:color w:val="FF0000"/>
-                <w:szCs w:val="24"/>
-                <w:lang w:val="es-ES" w:eastAsia="es-ES"/>
-              </w:rPr>
-              <w:instrText>MACROBUTTON NoMacro [Fecha]</w:instrText>
-            </w:r>
-            <w:r>
-              <w:rPr>
-                <w:rFonts w:cstheme="minorHAnsi"/>
-                <w:i/>
-                <w:color w:val="FF0000"/>
-                <w:szCs w:val="24"/>
-                <w:lang w:val="es-ES" w:eastAsia="es-ES"/>
-              </w:rPr>
-              <w:fldChar w:fldCharType="end"/>
+              <w:t>16-10-2026</w:t>
             </w:r>
           </w:p>
         </w:tc>
         <w:tc>
           <w:tcPr>
-            <w:tcW w:w="1080" w:type="dxa"/>
-            <w:vAlign w:val="center"/>
+            <w:tcW w:type="dxa" w:w="2209"/>
+            <w:tcBorders>
+              <w:top w:val="single" w:sz="4" w:color="D9D9D9"/>
+              <w:left w:val="single" w:sz="4" w:color="D9D9D9"/>
+              <w:bottom w:val="single" w:sz="4" w:color="D9D9D9"/>
+              <w:right w:val="single" w:sz="4" w:color="D9D9D9"/>
+            </w:tcBorders>
+            <w:tcMar>
+              <w:top w:w="80" w:type="dxa"/>
+              <w:left w:w="80" w:type="dxa"/>
+              <w:bottom w:w="80" w:type="dxa"/>
+              <w:right w:w="80" w:type="dxa"/>
+            </w:tcMar>
           </w:tcPr>
           <w:p>
             <w:pPr>
-              <w:jc w:val="both"/>
-              <w:rPr>
-                <w:rFonts w:asciiTheme="minorHAnsi" w:hAnsiTheme="minorHAnsi" w:cstheme="minorHAnsi"/>
-                <w:i/>
-                <w:color w:val="FF0000"/>
-                <w:szCs w:val="24"/>
-                <w:lang w:val="es-ES" w:eastAsia="es-ES"/>
-              </w:rPr>
+              <w:keepNext w:val="0"/>
+              <w:keepLines w:val="0"/>
+              <w:spacing w:after="100" w:line="240" w:lineRule="auto"/>
             </w:pPr>
             <w:r>
               <w:rPr>
-                <w:rFonts w:cstheme="minorHAnsi"/>
-                <w:i/>
-                <w:color w:val="FF0000"/>
-                <w:szCs w:val="24"/>
-                <w:lang w:val="es-ES" w:eastAsia="es-ES"/>
+                <w:rFonts w:ascii="Arial" w:hAnsi="Arial"/>
+                <w:b w:val="0"/>
+                <w:color w:val="000000"/>
+                <w:sz w:val="22"/>
               </w:rPr>
-              <w:fldChar w:fldCharType="begin"/>
-            </w:r>
-            <w:r>
-              <w:rPr>
-                <w:rFonts w:asciiTheme="minorHAnsi" w:hAnsiTheme="minorHAnsi" w:cstheme="minorHAnsi"/>
-                <w:i/>
-                <w:color w:val="FF0000"/>
-                <w:szCs w:val="24"/>
-                <w:lang w:val="es-ES" w:eastAsia="es-ES"/>
-              </w:rPr>
-              <w:instrText>MACROBUTTON NoMacro [Rev]</w:instrText>
-            </w:r>
-            <w:r>
-              <w:rPr>
-                <w:rFonts w:cstheme="minorHAnsi"/>
-                <w:i/>
-                <w:color w:val="FF0000"/>
-                <w:szCs w:val="24"/>
-                <w:lang w:val="es-ES" w:eastAsia="es-ES"/>
-              </w:rPr>
-              <w:fldChar w:fldCharType="end"/>
+              <w:t>02</w:t>
             </w:r>
           </w:p>
         </w:tc>
         <w:tc>
           <w:tcPr>
-            <w:tcW w:w="3060" w:type="dxa"/>
-            <w:vAlign w:val="center"/>
+            <w:tcW w:type="dxa" w:w="2209"/>
+            <w:tcBorders>
+              <w:top w:val="single" w:sz="4" w:color="D9D9D9"/>
+              <w:left w:val="single" w:sz="4" w:color="D9D9D9"/>
+              <w:bottom w:val="single" w:sz="4" w:color="D9D9D9"/>
+              <w:right w:val="single" w:sz="4" w:color="D9D9D9"/>
+            </w:tcBorders>
+            <w:tcMar>
+              <w:top w:w="80" w:type="dxa"/>
+              <w:left w:w="80" w:type="dxa"/>
+              <w:bottom w:w="80" w:type="dxa"/>
+              <w:right w:w="80" w:type="dxa"/>
+            </w:tcMar>
           </w:tcPr>
           <w:p>
             <w:pPr>
-              <w:jc w:val="both"/>
-              <w:rPr>
-                <w:rFonts w:asciiTheme="minorHAnsi" w:hAnsiTheme="minorHAnsi" w:cstheme="minorHAnsi"/>
-                <w:i/>
-                <w:color w:val="FF0000"/>
-                <w:szCs w:val="24"/>
-                <w:lang w:val="es-ES" w:eastAsia="es-ES"/>
-              </w:rPr>
+              <w:keepNext w:val="0"/>
+              <w:keepLines w:val="0"/>
+              <w:spacing w:after="100" w:line="240" w:lineRule="auto"/>
             </w:pPr>
             <w:r>
               <w:rPr>
-                <w:rFonts w:cstheme="minorHAnsi"/>
-                <w:i/>
-                <w:color w:val="FF0000"/>
-                <w:szCs w:val="24"/>
-                <w:lang w:val="es-ES" w:eastAsia="es-ES"/>
+                <w:rFonts w:ascii="Arial" w:hAnsi="Arial"/>
+                <w:b w:val="0"/>
+                <w:color w:val="000000"/>
+                <w:sz w:val="22"/>
               </w:rPr>
-              <w:fldChar w:fldCharType="begin"/>
-            </w:r>
-            <w:r>
-              <w:rPr>
-                <w:rFonts w:asciiTheme="minorHAnsi" w:hAnsiTheme="minorHAnsi" w:cstheme="minorHAnsi"/>
-                <w:i/>
-                <w:color w:val="FF0000"/>
-                <w:szCs w:val="24"/>
-                <w:lang w:val="es-ES" w:eastAsia="es-ES"/>
-              </w:rPr>
-              <w:instrText>MACROBUTTON NoMacro [Descripcion]</w:instrText>
-            </w:r>
-            <w:r>
-              <w:rPr>
-                <w:rFonts w:cstheme="minorHAnsi"/>
-                <w:i/>
-                <w:color w:val="FF0000"/>
-                <w:szCs w:val="24"/>
-                <w:lang w:val="es-ES" w:eastAsia="es-ES"/>
-              </w:rPr>
-              <w:fldChar w:fldCharType="end"/>
+              <w:t>Daniel Ávila y Raúl González</w:t>
             </w:r>
           </w:p>
         </w:tc>
         <w:tc>
           <w:tcPr>
-            <w:tcW w:w="3316" w:type="dxa"/>
-            <w:vAlign w:val="center"/>
+            <w:tcW w:type="dxa" w:w="2209"/>
+            <w:tcBorders>
+              <w:top w:val="single" w:sz="4" w:color="D9D9D9"/>
+              <w:left w:val="single" w:sz="4" w:color="D9D9D9"/>
+              <w:bottom w:val="single" w:sz="4" w:color="D9D9D9"/>
+              <w:right w:val="single" w:sz="4" w:color="D9D9D9"/>
+            </w:tcBorders>
+            <w:tcMar>
+              <w:top w:w="80" w:type="dxa"/>
+              <w:left w:w="80" w:type="dxa"/>
+              <w:bottom w:w="80" w:type="dxa"/>
+              <w:right w:w="80" w:type="dxa"/>
+            </w:tcMar>
           </w:tcPr>
           <w:p>
             <w:pPr>
-              <w:jc w:val="both"/>
-              <w:rPr>
-                <w:rFonts w:asciiTheme="minorHAnsi" w:hAnsiTheme="minorHAnsi" w:cstheme="minorHAnsi"/>
-                <w:i/>
-                <w:color w:val="FF0000"/>
-                <w:szCs w:val="24"/>
-                <w:lang w:val="es-ES" w:eastAsia="es-ES"/>
-              </w:rPr>
+              <w:keepNext w:val="0"/>
+              <w:keepLines w:val="0"/>
+              <w:spacing w:after="100" w:line="240" w:lineRule="auto"/>
             </w:pPr>
             <w:r>
               <w:rPr>
-                <w:rFonts w:cstheme="minorHAnsi"/>
-                <w:i/>
-                <w:color w:val="FF0000"/>
-                <w:szCs w:val="24"/>
-                <w:lang w:val="es-ES" w:eastAsia="es-ES"/>
+                <w:rFonts w:ascii="Arial" w:hAnsi="Arial"/>
+                <w:b w:val="0"/>
+                <w:color w:val="000000"/>
+                <w:sz w:val="22"/>
               </w:rPr>
-              <w:fldChar w:fldCharType="begin"/>
-            </w:r>
-            <w:r>
-              <w:rPr>
-                <w:rFonts w:asciiTheme="minorHAnsi" w:hAnsiTheme="minorHAnsi" w:cstheme="minorHAnsi"/>
-                <w:i/>
-                <w:color w:val="FF0000"/>
-                <w:szCs w:val="24"/>
-                <w:lang w:val="es-ES" w:eastAsia="es-ES"/>
-              </w:rPr>
-              <w:instrText>MACROBUTTON NoMacro [Descripcion]</w:instrText>
-            </w:r>
-            <w:r>
-              <w:rPr>
-                <w:rFonts w:cstheme="minorHAnsi"/>
-                <w:i/>
-                <w:color w:val="FF0000"/>
-                <w:szCs w:val="24"/>
-                <w:lang w:val="es-ES" w:eastAsia="es-ES"/>
-              </w:rPr>
-              <w:fldChar w:fldCharType="end"/>
-            </w:r>
-          </w:p>
-        </w:tc>
-      </w:tr>
-      <w:tr>
-        <w:trPr>
-          <w:trHeight w:val="1134"/>
-        </w:trPr>
-        <w:tc>
-          <w:tcPr>
-            <w:tcW w:w="1188" w:type="dxa"/>
-            <w:vAlign w:val="center"/>
-          </w:tcPr>
-          <w:p>
-            <w:pPr>
-              <w:jc w:val="both"/>
-              <w:rPr>
-                <w:rFonts w:asciiTheme="minorHAnsi" w:hAnsiTheme="minorHAnsi" w:cstheme="minorHAnsi"/>
-                <w:i/>
-                <w:color w:val="FF0000"/>
-                <w:szCs w:val="24"/>
-                <w:lang w:val="es-ES" w:eastAsia="es-ES"/>
-              </w:rPr>
-            </w:pPr>
-            <w:r>
-              <w:rPr>
-                <w:rFonts w:cstheme="minorHAnsi"/>
-                <w:i/>
-                <w:color w:val="FF0000"/>
-                <w:szCs w:val="24"/>
-                <w:lang w:val="es-ES" w:eastAsia="es-ES"/>
-              </w:rPr>
-              <w:fldChar w:fldCharType="begin"/>
-            </w:r>
-            <w:r>
-              <w:rPr>
-                <w:rFonts w:asciiTheme="minorHAnsi" w:hAnsiTheme="minorHAnsi" w:cstheme="minorHAnsi"/>
-                <w:i/>
-                <w:color w:val="FF0000"/>
-                <w:szCs w:val="24"/>
-                <w:lang w:val="es-ES" w:eastAsia="es-ES"/>
-              </w:rPr>
-              <w:instrText>MACROBUTTON NoMacro [Fecha]</w:instrText>
-            </w:r>
-            <w:r>
-              <w:rPr>
-                <w:rFonts w:cstheme="minorHAnsi"/>
-                <w:i/>
-                <w:color w:val="FF0000"/>
-                <w:szCs w:val="24"/>
-                <w:lang w:val="es-ES" w:eastAsia="es-ES"/>
-              </w:rPr>
-              <w:fldChar w:fldCharType="end"/>
-            </w:r>
-          </w:p>
-        </w:tc>
-        <w:tc>
-          <w:tcPr>
-            <w:tcW w:w="1080" w:type="dxa"/>
-            <w:vAlign w:val="center"/>
-          </w:tcPr>
-          <w:p>
-            <w:pPr>
-              <w:jc w:val="both"/>
-              <w:rPr>
-                <w:rFonts w:asciiTheme="minorHAnsi" w:hAnsiTheme="minorHAnsi" w:cstheme="minorHAnsi"/>
-                <w:i/>
-                <w:color w:val="FF0000"/>
-                <w:szCs w:val="24"/>
-                <w:lang w:val="es-ES" w:eastAsia="es-ES"/>
-              </w:rPr>
-            </w:pPr>
-            <w:r>
-              <w:rPr>
-                <w:rFonts w:cstheme="minorHAnsi"/>
-                <w:i/>
-                <w:color w:val="FF0000"/>
-                <w:szCs w:val="24"/>
-                <w:lang w:val="es-ES" w:eastAsia="es-ES"/>
-              </w:rPr>
-              <w:fldChar w:fldCharType="begin"/>
-            </w:r>
-            <w:r>
-              <w:rPr>
-                <w:rFonts w:asciiTheme="minorHAnsi" w:hAnsiTheme="minorHAnsi" w:cstheme="minorHAnsi"/>
-                <w:i/>
-                <w:color w:val="FF0000"/>
-                <w:szCs w:val="24"/>
-                <w:lang w:val="es-ES" w:eastAsia="es-ES"/>
-              </w:rPr>
-              <w:instrText>MACROBUTTON NoMacro [Rev]</w:instrText>
-            </w:r>
-            <w:r>
-              <w:rPr>
-                <w:rFonts w:cstheme="minorHAnsi"/>
-                <w:i/>
-                <w:color w:val="FF0000"/>
-                <w:szCs w:val="24"/>
-                <w:lang w:val="es-ES" w:eastAsia="es-ES"/>
-              </w:rPr>
-              <w:fldChar w:fldCharType="end"/>
-            </w:r>
-          </w:p>
-        </w:tc>
-        <w:tc>
-          <w:tcPr>
-            <w:tcW w:w="3060" w:type="dxa"/>
-            <w:vAlign w:val="center"/>
-          </w:tcPr>
-          <w:p>
-            <w:pPr>
-              <w:jc w:val="both"/>
-              <w:rPr>
-                <w:rFonts w:asciiTheme="minorHAnsi" w:hAnsiTheme="minorHAnsi" w:cstheme="minorHAnsi"/>
-                <w:i/>
-                <w:color w:val="FF0000"/>
-                <w:szCs w:val="24"/>
-                <w:lang w:val="es-ES" w:eastAsia="es-ES"/>
-              </w:rPr>
-            </w:pPr>
-            <w:r>
-              <w:rPr>
-                <w:rFonts w:cstheme="minorHAnsi"/>
-                <w:i/>
-                <w:color w:val="FF0000"/>
-                <w:szCs w:val="24"/>
-                <w:lang w:val="es-ES" w:eastAsia="es-ES"/>
-              </w:rPr>
-              <w:fldChar w:fldCharType="begin"/>
-            </w:r>
-            <w:r>
-              <w:rPr>
-                <w:rFonts w:asciiTheme="minorHAnsi" w:hAnsiTheme="minorHAnsi" w:cstheme="minorHAnsi"/>
-                <w:i/>
-                <w:color w:val="FF0000"/>
-                <w:szCs w:val="24"/>
-                <w:lang w:val="es-ES" w:eastAsia="es-ES"/>
-              </w:rPr>
-              <w:instrText>MACROBUTTON NoMacro [Descripcion]</w:instrText>
-            </w:r>
-            <w:r>
-              <w:rPr>
-                <w:rFonts w:cstheme="minorHAnsi"/>
-                <w:i/>
-                <w:color w:val="FF0000"/>
-                <w:szCs w:val="24"/>
-                <w:lang w:val="es-ES" w:eastAsia="es-ES"/>
-              </w:rPr>
-              <w:fldChar w:fldCharType="end"/>
-            </w:r>
-          </w:p>
-        </w:tc>
-        <w:tc>
-          <w:tcPr>
-            <w:tcW w:w="3316" w:type="dxa"/>
-            <w:vAlign w:val="center"/>
-          </w:tcPr>
-          <w:p>
-            <w:pPr>
-              <w:jc w:val="both"/>
-              <w:rPr>
-                <w:rFonts w:asciiTheme="minorHAnsi" w:hAnsiTheme="minorHAnsi" w:cstheme="minorHAnsi"/>
-                <w:i/>
-                <w:color w:val="FF0000"/>
-                <w:szCs w:val="24"/>
-                <w:lang w:val="es-ES" w:eastAsia="es-ES"/>
-              </w:rPr>
-            </w:pPr>
-            <w:r>
-              <w:rPr>
-                <w:rFonts w:cstheme="minorHAnsi"/>
-                <w:i/>
-                <w:color w:val="FF0000"/>
-                <w:szCs w:val="24"/>
-                <w:lang w:val="es-ES" w:eastAsia="es-ES"/>
-              </w:rPr>
-              <w:fldChar w:fldCharType="begin"/>
-            </w:r>
-            <w:r>
-              <w:rPr>
-                <w:rFonts w:asciiTheme="minorHAnsi" w:hAnsiTheme="minorHAnsi" w:cstheme="minorHAnsi"/>
-                <w:i/>
-                <w:color w:val="FF0000"/>
-                <w:szCs w:val="24"/>
-                <w:lang w:val="es-ES" w:eastAsia="es-ES"/>
-              </w:rPr>
-              <w:instrText>MACROBUTTON NoMacro [Descripcion]</w:instrText>
-            </w:r>
-            <w:r>
-              <w:rPr>
-                <w:rFonts w:cstheme="minorHAnsi"/>
-                <w:i/>
-                <w:color w:val="FF0000"/>
-                <w:szCs w:val="24"/>
-                <w:lang w:val="es-ES" w:eastAsia="es-ES"/>
-              </w:rPr>
-              <w:fldChar w:fldCharType="end"/>
+              <w:t>Actualización al release público y evidencias de Fase 2</w:t>
             </w:r>
           </w:p>
         </w:tc>
       </w:tr>
     </w:tbl>
     <w:p>
-      <w:pPr>
-        <w:spacing w:after="0" w:line="240" w:lineRule="auto"/>
-        <w:jc w:val="both"/>
-        <w:rPr>
-          <w:rFonts w:eastAsia="Times New Roman" w:cstheme="minorHAnsi"/>
-          <w:sz w:val="20"/>
-          <w:szCs w:val="24"/>
-          <w:lang w:val="es-ES" w:eastAsia="es-ES"/>
-        </w:rPr>
-      </w:pPr>
-    </w:p>
-    <w:p>
-      <w:pPr>
-        <w:spacing w:after="0" w:line="240" w:lineRule="auto"/>
-        <w:jc w:val="both"/>
-        <w:rPr>
-          <w:rFonts w:eastAsia="Times New Roman" w:cstheme="minorHAnsi"/>
-          <w:sz w:val="20"/>
-          <w:szCs w:val="24"/>
-          <w:lang w:val="fr-FR" w:eastAsia="es-ES"/>
-        </w:rPr>
-      </w:pPr>
-    </w:p>
-    <w:p>
-      <w:pPr>
-        <w:spacing w:after="0" w:line="240" w:lineRule="auto"/>
-        <w:jc w:val="both"/>
-        <w:rPr>
-          <w:rFonts w:eastAsia="Times New Roman" w:cstheme="minorHAnsi"/>
-          <w:sz w:val="20"/>
-          <w:szCs w:val="24"/>
-          <w:lang w:val="fr-FR" w:eastAsia="es-ES"/>
-        </w:rPr>
-      </w:pPr>
-    </w:p>
-    <w:p>
-      <w:pPr>
-        <w:spacing w:after="0" w:line="240" w:lineRule="auto"/>
-        <w:jc w:val="both"/>
-        <w:rPr>
-          <w:rFonts w:eastAsia="Times New Roman" w:cstheme="minorHAnsi"/>
-          <w:sz w:val="20"/>
-          <w:szCs w:val="24"/>
-          <w:lang w:val="es-ES" w:eastAsia="es-ES"/>
-        </w:rPr>
-      </w:pPr>
       <w:r>
-        <w:rPr>
-          <w:rFonts w:eastAsia="Times New Roman" w:cstheme="minorHAnsi"/>
-          <w:sz w:val="20"/>
-          <w:szCs w:val="24"/>
-          <w:lang w:val="es-ES" w:eastAsia="es-ES"/>
-        </w:rPr>
-        <w:t xml:space="preserve">Documento validado por las partes en fecha: </w:t>
-      </w:r>
-      <w:r>
-        <w:rPr>
-          <w:rFonts w:eastAsia="Times New Roman" w:cstheme="minorHAnsi"/>
-          <w:color w:val="FF0000"/>
-          <w:sz w:val="20"/>
-          <w:szCs w:val="24"/>
-          <w:lang w:val="es-ES" w:eastAsia="es-ES"/>
-        </w:rPr>
-        <w:fldChar w:fldCharType="begin"/>
-      </w:r>
-      <w:r>
-        <w:rPr>
-          <w:rFonts w:eastAsia="Times New Roman" w:cstheme="minorHAnsi"/>
-          <w:color w:val="FF0000"/>
-          <w:sz w:val="20"/>
-          <w:szCs w:val="24"/>
-          <w:lang w:val="es-ES" w:eastAsia="es-ES"/>
-        </w:rPr>
-        <w:instrText>MACROBUTTON NoMacro [Fecha]</w:instrText>
-      </w:r>
-      <w:r>
-        <w:rPr>
-          <w:rFonts w:eastAsia="Times New Roman" w:cstheme="minorHAnsi"/>
-          <w:color w:val="FF0000"/>
-          <w:sz w:val="20"/>
-          <w:szCs w:val="24"/>
-          <w:lang w:val="es-ES" w:eastAsia="es-ES"/>
-        </w:rPr>
-        <w:fldChar w:fldCharType="end"/>
+        <w:t>Estado de revisión: preparado para revisión de ambos integrantes. No registra aprobación ni firma de terceros.</w:t>
       </w:r>
     </w:p>
     <w:p>
       <w:pPr>
-        <w:spacing w:after="0" w:line="240" w:lineRule="auto"/>
-        <w:jc w:val="both"/>
-        <w:rPr>
-          <w:rFonts w:eastAsia="Times New Roman" w:cstheme="minorHAnsi"/>
-          <w:sz w:val="20"/>
-          <w:szCs w:val="24"/>
-          <w:lang w:val="es-ES" w:eastAsia="es-ES"/>
-        </w:rPr>
-      </w:pPr>
-    </w:p>
-    <w:p>
-      <w:pPr>
-        <w:spacing w:after="0" w:line="240" w:lineRule="auto"/>
-        <w:jc w:val="both"/>
-        <w:rPr>
-          <w:rFonts w:eastAsia="Times New Roman" w:cstheme="minorHAnsi"/>
-          <w:sz w:val="20"/>
-          <w:szCs w:val="24"/>
-          <w:lang w:val="es-ES" w:eastAsia="es-ES"/>
-        </w:rPr>
-      </w:pPr>
-    </w:p>
-    <w:p>
-      <w:pPr>
-        <w:spacing w:after="0" w:line="240" w:lineRule="auto"/>
-        <w:jc w:val="both"/>
-        <w:rPr>
-          <w:rFonts w:eastAsia="Times New Roman" w:cstheme="minorHAnsi"/>
-          <w:sz w:val="20"/>
-          <w:szCs w:val="24"/>
-          <w:lang w:val="es-ES" w:eastAsia="es-ES"/>
-        </w:rPr>
-      </w:pPr>
-    </w:p>
-    <w:p>
-      <w:pPr>
         <w:pStyle w:val="Ttulo1"/>
       </w:pPr>
-      <w:bookmarkStart w:id="2" w:name="_Toc241503855"/>
       <w:r>
-        <w:t>Integrantes:</w:t>
+        <w:t>Integrantes</w:t>
       </w:r>
-      <w:bookmarkEnd w:id="2"/>
     </w:p>
     <w:tbl>
       <w:tblPr>
-        <w:tblStyle w:val="Tablaconcuadrcula1"/>
-        <w:tblW w:w="0" w:type="auto"/>
-        <w:tblBorders>
-          <w:top w:val="single" w:sz="4" w:space="0" w:color="808080"/>
-          <w:left w:val="single" w:sz="4" w:space="0" w:color="808080"/>
-          <w:bottom w:val="single" w:sz="4" w:space="0" w:color="808080"/>
-          <w:right w:val="single" w:sz="4" w:space="0" w:color="808080"/>
-          <w:insideH w:val="single" w:sz="4" w:space="0" w:color="808080"/>
-          <w:insideV w:val="single" w:sz="4" w:space="0" w:color="808080"/>
-        </w:tblBorders>
-        <w:tblLook w:val="01E0" w:firstRow="1" w:lastRow="1" w:firstColumn="1" w:lastColumn="1" w:noHBand="0" w:noVBand="0"/>
+        <w:tblW w:type="auto" w:w="0"/>
+        <w:tblLayout w:type="fixed"/>
+        <w:tblLook w:firstColumn="1" w:firstRow="1" w:lastColumn="0" w:lastRow="0" w:noHBand="0" w:noVBand="1" w:val="04A0"/>
       </w:tblPr>
       <w:tblGrid>
-        <w:gridCol w:w="3539"/>
-        <w:gridCol w:w="5275"/>
+        <w:gridCol w:w="4419"/>
+        <w:gridCol w:w="4419"/>
       </w:tblGrid>
       <w:tr>
+        <w:trPr>
+          <w:tblHeader/>
+        </w:trPr>
         <w:tc>
           <w:tcPr>
-            <w:tcW w:w="3539" w:type="dxa"/>
-            <w:shd w:val="clear" w:color="auto" w:fill="E6E6E6"/>
+            <w:tcW w:type="dxa" w:w="4419"/>
+            <w:tcBorders>
+              <w:top w:val="single" w:sz="4" w:color="D9D9D9"/>
+              <w:left w:val="single" w:sz="4" w:color="D9D9D9"/>
+              <w:bottom w:val="single" w:sz="4" w:color="D9D9D9"/>
+              <w:right w:val="single" w:sz="4" w:color="D9D9D9"/>
+            </w:tcBorders>
+            <w:tcMar>
+              <w:top w:w="80" w:type="dxa"/>
+              <w:left w:w="80" w:type="dxa"/>
+              <w:bottom w:w="80" w:type="dxa"/>
+              <w:right w:w="80" w:type="dxa"/>
+            </w:tcMar>
           </w:tcPr>
           <w:p>
             <w:pPr>
-              <w:jc w:val="both"/>
-              <w:rPr>
-                <w:rFonts w:asciiTheme="minorHAnsi" w:hAnsiTheme="minorHAnsi" w:cstheme="minorHAnsi"/>
-                <w:b/>
-                <w:szCs w:val="24"/>
-                <w:lang w:val="es-ES" w:eastAsia="es-ES"/>
-              </w:rPr>
+              <w:keepNext w:val="0"/>
+              <w:keepLines w:val="0"/>
+              <w:spacing w:after="100" w:line="240" w:lineRule="auto"/>
             </w:pPr>
             <w:r>
               <w:rPr>
-                <w:rFonts w:asciiTheme="minorHAnsi" w:hAnsiTheme="minorHAnsi" w:cstheme="minorHAnsi"/>
-                <w:b/>
-                <w:szCs w:val="24"/>
-                <w:lang w:val="es-ES" w:eastAsia="es-ES"/>
+                <w:rFonts w:ascii="Arial" w:hAnsi="Arial"/>
+                <w:b w:val="0"/>
+                <w:color w:val="000000"/>
+                <w:sz w:val="22"/>
               </w:rPr>
-              <w:t>Nombre Integrante del Equipo</w:t>
+              <w:t>Nombre</w:t>
             </w:r>
           </w:p>
         </w:tc>
         <w:tc>
           <w:tcPr>
-            <w:tcW w:w="5275" w:type="dxa"/>
-            <w:shd w:val="clear" w:color="auto" w:fill="E6E6E6"/>
+            <w:tcW w:type="dxa" w:w="4419"/>
+            <w:tcBorders>
+              <w:top w:val="single" w:sz="4" w:color="D9D9D9"/>
+              <w:left w:val="single" w:sz="4" w:color="D9D9D9"/>
+              <w:bottom w:val="single" w:sz="4" w:color="D9D9D9"/>
+              <w:right w:val="single" w:sz="4" w:color="D9D9D9"/>
+            </w:tcBorders>
+            <w:tcMar>
+              <w:top w:w="80" w:type="dxa"/>
+              <w:left w:w="80" w:type="dxa"/>
+              <w:bottom w:w="80" w:type="dxa"/>
+              <w:right w:w="80" w:type="dxa"/>
+            </w:tcMar>
           </w:tcPr>
           <w:p>
             <w:pPr>
-              <w:jc w:val="both"/>
-              <w:rPr>
-                <w:rFonts w:asciiTheme="minorHAnsi" w:hAnsiTheme="minorHAnsi" w:cstheme="minorHAnsi"/>
-                <w:b/>
-                <w:szCs w:val="24"/>
-                <w:lang w:val="es-ES" w:eastAsia="es-ES"/>
-              </w:rPr>
+              <w:keepNext w:val="0"/>
+              <w:keepLines w:val="0"/>
+              <w:spacing w:after="100" w:line="240" w:lineRule="auto"/>
             </w:pPr>
             <w:r>
               <w:rPr>
-                <w:rFonts w:asciiTheme="minorHAnsi" w:hAnsiTheme="minorHAnsi" w:cstheme="minorHAnsi"/>
-                <w:b/>
-                <w:szCs w:val="24"/>
-                <w:lang w:val="es-ES" w:eastAsia="es-ES"/>
+                <w:rFonts w:ascii="Arial" w:hAnsi="Arial"/>
+                <w:b w:val="0"/>
+                <w:color w:val="000000"/>
+                <w:sz w:val="22"/>
               </w:rPr>
-              <w:t>Rol Definido</w:t>
+              <w:t>Responsabilidad</w:t>
             </w:r>
           </w:p>
         </w:tc>
       </w:tr>
       <w:tr>
-        <w:trPr>
-          <w:trHeight w:val="465"/>
-        </w:trPr>
         <w:tc>
           <w:tcPr>
-            <w:tcW w:w="3539" w:type="dxa"/>
-            <w:vAlign w:val="center"/>
+            <w:tcW w:type="dxa" w:w="4419"/>
+            <w:tcBorders>
+              <w:top w:val="single" w:sz="4" w:color="D9D9D9"/>
+              <w:left w:val="single" w:sz="4" w:color="D9D9D9"/>
+              <w:bottom w:val="single" w:sz="4" w:color="D9D9D9"/>
+              <w:right w:val="single" w:sz="4" w:color="D9D9D9"/>
+            </w:tcBorders>
+            <w:tcMar>
+              <w:top w:w="80" w:type="dxa"/>
+              <w:left w:w="80" w:type="dxa"/>
+              <w:bottom w:w="80" w:type="dxa"/>
+              <w:right w:w="80" w:type="dxa"/>
+            </w:tcMar>
           </w:tcPr>
           <w:p>
             <w:pPr>
-              <w:jc w:val="both"/>
+              <w:keepNext w:val="0"/>
+              <w:keepLines w:val="0"/>
+              <w:spacing w:after="100" w:line="240" w:lineRule="auto"/>
+            </w:pPr>
+            <w:r>
               <w:rPr>
-                <w:rFonts w:asciiTheme="minorHAnsi" w:hAnsiTheme="minorHAnsi" w:cstheme="minorHAnsi"/>
-                <w:i/>
-                <w:szCs w:val="24"/>
-                <w:lang w:val="es-ES" w:eastAsia="es-ES"/>
+                <w:rFonts w:ascii="Arial" w:hAnsi="Arial"/>
+                <w:b w:val="0"/>
+                <w:color w:val="000000"/>
+                <w:sz w:val="22"/>
               </w:rPr>
-            </w:pPr>
+              <w:t>Daniel Ávila</w:t>
+            </w:r>
           </w:p>
         </w:tc>
         <w:tc>
           <w:tcPr>
-            <w:tcW w:w="5275" w:type="dxa"/>
-            <w:vAlign w:val="center"/>
+            <w:tcW w:type="dxa" w:w="4419"/>
+            <w:tcBorders>
+              <w:top w:val="single" w:sz="4" w:color="D9D9D9"/>
+              <w:left w:val="single" w:sz="4" w:color="D9D9D9"/>
+              <w:bottom w:val="single" w:sz="4" w:color="D9D9D9"/>
+              <w:right w:val="single" w:sz="4" w:color="D9D9D9"/>
+            </w:tcBorders>
+            <w:tcMar>
+              <w:top w:w="80" w:type="dxa"/>
+              <w:left w:w="80" w:type="dxa"/>
+              <w:bottom w:w="80" w:type="dxa"/>
+              <w:right w:w="80" w:type="dxa"/>
+            </w:tcMar>
           </w:tcPr>
           <w:p>
             <w:pPr>
-              <w:jc w:val="both"/>
+              <w:keepNext w:val="0"/>
+              <w:keepLines w:val="0"/>
+              <w:spacing w:after="100" w:line="240" w:lineRule="auto"/>
+            </w:pPr>
+            <w:r>
               <w:rPr>
-                <w:rFonts w:asciiTheme="minorHAnsi" w:hAnsiTheme="minorHAnsi" w:cstheme="minorHAnsi"/>
-                <w:i/>
-                <w:szCs w:val="24"/>
-                <w:lang w:val="es-ES" w:eastAsia="es-ES"/>
+                <w:rFonts w:ascii="Arial" w:hAnsi="Arial"/>
+                <w:b w:val="0"/>
+                <w:color w:val="000000"/>
+                <w:sz w:val="22"/>
               </w:rPr>
-            </w:pPr>
+              <w:t>Datos y lógica de negocio; colaboración en captura, formularios y publicación.</w:t>
+            </w:r>
           </w:p>
         </w:tc>
       </w:tr>
       <w:tr>
-        <w:trPr>
-          <w:trHeight w:val="465"/>
-        </w:trPr>
         <w:tc>
           <w:tcPr>
-            <w:tcW w:w="3539" w:type="dxa"/>
-            <w:vAlign w:val="center"/>
+            <w:tcW w:type="dxa" w:w="4419"/>
+            <w:tcBorders>
+              <w:top w:val="single" w:sz="4" w:color="D9D9D9"/>
+              <w:left w:val="single" w:sz="4" w:color="D9D9D9"/>
+              <w:bottom w:val="single" w:sz="4" w:color="D9D9D9"/>
+              <w:right w:val="single" w:sz="4" w:color="D9D9D9"/>
+            </w:tcBorders>
+            <w:tcMar>
+              <w:top w:w="80" w:type="dxa"/>
+              <w:left w:w="80" w:type="dxa"/>
+              <w:bottom w:w="80" w:type="dxa"/>
+              <w:right w:w="80" w:type="dxa"/>
+            </w:tcMar>
           </w:tcPr>
           <w:p>
             <w:pPr>
-              <w:jc w:val="both"/>
+              <w:keepNext w:val="0"/>
+              <w:keepLines w:val="0"/>
+              <w:spacing w:after="100" w:line="240" w:lineRule="auto"/>
+            </w:pPr>
+            <w:r>
               <w:rPr>
-                <w:rFonts w:cstheme="minorHAnsi"/>
-                <w:i/>
-                <w:szCs w:val="24"/>
-                <w:lang w:val="es-ES" w:eastAsia="es-ES"/>
+                <w:rFonts w:ascii="Arial" w:hAnsi="Arial"/>
+                <w:b w:val="0"/>
+                <w:color w:val="000000"/>
+                <w:sz w:val="22"/>
               </w:rPr>
-            </w:pPr>
+              <w:t>Raúl González</w:t>
+            </w:r>
           </w:p>
         </w:tc>
         <w:tc>
           <w:tcPr>
-            <w:tcW w:w="5275" w:type="dxa"/>
-            <w:vAlign w:val="center"/>
+            <w:tcW w:type="dxa" w:w="4419"/>
+            <w:tcBorders>
+              <w:top w:val="single" w:sz="4" w:color="D9D9D9"/>
+              <w:left w:val="single" w:sz="4" w:color="D9D9D9"/>
+              <w:bottom w:val="single" w:sz="4" w:color="D9D9D9"/>
+              <w:right w:val="single" w:sz="4" w:color="D9D9D9"/>
+            </w:tcBorders>
+            <w:tcMar>
+              <w:top w:w="80" w:type="dxa"/>
+              <w:left w:w="80" w:type="dxa"/>
+              <w:bottom w:w="80" w:type="dxa"/>
+              <w:right w:w="80" w:type="dxa"/>
+            </w:tcMar>
           </w:tcPr>
           <w:p>
             <w:pPr>
-              <w:jc w:val="both"/>
+              <w:keepNext w:val="0"/>
+              <w:keepLines w:val="0"/>
+              <w:spacing w:after="100" w:line="240" w:lineRule="auto"/>
+            </w:pPr>
+            <w:r>
               <w:rPr>
-                <w:rFonts w:cstheme="minorHAnsi"/>
-                <w:i/>
-                <w:szCs w:val="24"/>
-                <w:lang w:val="es-ES" w:eastAsia="es-ES"/>
+                <w:rFonts w:ascii="Arial" w:hAnsi="Arial"/>
+                <w:b w:val="0"/>
+                <w:color w:val="000000"/>
+                <w:sz w:val="22"/>
               </w:rPr>
-            </w:pPr>
-          </w:p>
-        </w:tc>
-      </w:tr>
-      <w:tr>
-        <w:trPr>
-          <w:trHeight w:val="465"/>
-        </w:trPr>
-        <w:tc>
-          <w:tcPr>
-            <w:tcW w:w="3539" w:type="dxa"/>
-            <w:vAlign w:val="center"/>
-          </w:tcPr>
-          <w:p>
-            <w:pPr>
-              <w:jc w:val="both"/>
-              <w:rPr>
-                <w:rFonts w:cstheme="minorHAnsi"/>
-                <w:i/>
-                <w:szCs w:val="24"/>
-                <w:lang w:val="es-ES" w:eastAsia="es-ES"/>
-              </w:rPr>
-            </w:pPr>
-          </w:p>
-        </w:tc>
-        <w:tc>
-          <w:tcPr>
-            <w:tcW w:w="5275" w:type="dxa"/>
-            <w:vAlign w:val="center"/>
-          </w:tcPr>
-          <w:p>
-            <w:pPr>
-              <w:jc w:val="both"/>
-              <w:rPr>
-                <w:rFonts w:cstheme="minorHAnsi"/>
-                <w:i/>
-                <w:szCs w:val="24"/>
-                <w:lang w:val="es-ES" w:eastAsia="es-ES"/>
-              </w:rPr>
-            </w:pPr>
-          </w:p>
-        </w:tc>
-      </w:tr>
-      <w:tr>
-        <w:trPr>
-          <w:trHeight w:val="465"/>
-        </w:trPr>
-        <w:tc>
-          <w:tcPr>
-            <w:tcW w:w="3539" w:type="dxa"/>
-            <w:vAlign w:val="center"/>
-          </w:tcPr>
-          <w:p>
-            <w:pPr>
-              <w:jc w:val="both"/>
-              <w:rPr>
-                <w:rFonts w:cstheme="minorHAnsi"/>
-                <w:i/>
-                <w:szCs w:val="24"/>
-                <w:lang w:val="es-ES" w:eastAsia="es-ES"/>
-              </w:rPr>
-            </w:pPr>
-          </w:p>
-        </w:tc>
-        <w:tc>
-          <w:tcPr>
-            <w:tcW w:w="5275" w:type="dxa"/>
-            <w:vAlign w:val="center"/>
-          </w:tcPr>
-          <w:p>
-            <w:pPr>
-              <w:jc w:val="both"/>
-              <w:rPr>
-                <w:rFonts w:cstheme="minorHAnsi"/>
-                <w:i/>
-                <w:szCs w:val="24"/>
-                <w:lang w:val="es-ES" w:eastAsia="es-ES"/>
-              </w:rPr>
-            </w:pPr>
-          </w:p>
-        </w:tc>
-      </w:tr>
-      <w:tr>
-        <w:trPr>
-          <w:trHeight w:val="465"/>
-        </w:trPr>
-        <w:tc>
-          <w:tcPr>
-            <w:tcW w:w="3539" w:type="dxa"/>
-            <w:vAlign w:val="center"/>
-          </w:tcPr>
-          <w:p>
-            <w:pPr>
-              <w:jc w:val="both"/>
-              <w:rPr>
-                <w:rFonts w:cstheme="minorHAnsi"/>
-                <w:i/>
-                <w:szCs w:val="24"/>
-                <w:lang w:val="es-ES" w:eastAsia="es-ES"/>
-              </w:rPr>
-            </w:pPr>
-          </w:p>
-        </w:tc>
-        <w:tc>
-          <w:tcPr>
-            <w:tcW w:w="5275" w:type="dxa"/>
-            <w:vAlign w:val="center"/>
-          </w:tcPr>
-          <w:p>
-            <w:pPr>
-              <w:jc w:val="both"/>
-              <w:rPr>
-                <w:rFonts w:cstheme="minorHAnsi"/>
-                <w:i/>
-                <w:szCs w:val="24"/>
-                <w:lang w:val="es-ES" w:eastAsia="es-ES"/>
-              </w:rPr>
-            </w:pPr>
+              <w:t>Infraestructura, plataforma y validación; informe de avance y colaboración en sincronización.</w:t>
+            </w:r>
           </w:p>
         </w:tc>
       </w:tr>
     </w:tbl>
-    <w:p/>
     <w:p>
       <w:pPr>
-        <w:jc w:val="both"/>
-        <w:rPr>
-          <w:rFonts w:eastAsiaTheme="majorEastAsia" w:cstheme="minorHAnsi"/>
-          <w:b/>
-          <w:bCs/>
-          <w:color w:val="365F91" w:themeColor="accent1" w:themeShade="BF"/>
-          <w:sz w:val="28"/>
-          <w:szCs w:val="28"/>
-        </w:rPr>
+        <w:pStyle w:val="Ttulo1"/>
       </w:pPr>
       <w:r>
-        <w:rPr>
-          <w:rFonts w:cstheme="minorHAnsi"/>
-        </w:rPr>
-        <w:br w:type="page"/>
+        <w:t>Producto Vision</w:t>
       </w:r>
     </w:p>
     <w:p>
       <w:pPr>
-        <w:pStyle w:val="Ttulo1"/>
-        <w:jc w:val="both"/>
-        <w:rPr>
-          <w:rFonts w:asciiTheme="minorHAnsi" w:hAnsiTheme="minorHAnsi" w:cstheme="minorHAnsi"/>
-        </w:rPr>
-      </w:pPr>
-      <w:bookmarkStart w:id="3" w:name="_Toc241503856"/>
+        <w:pStyle w:val="Ttulo2"/>
+      </w:pPr>
       <w:r>
-        <w:rPr>
-          <w:rFonts w:asciiTheme="minorHAnsi" w:hAnsiTheme="minorHAnsi" w:cstheme="minorHAnsi"/>
-        </w:rPr>
-        <w:lastRenderedPageBreak/>
-        <w:t>Producto Vision</w:t>
-      </w:r>
-      <w:bookmarkEnd w:id="3"/>
-    </w:p>
-    <w:p>
-      <w:pPr>
-        <w:pStyle w:val="Ttulo2"/>
-        <w:jc w:val="both"/>
-        <w:rPr>
-          <w:rFonts w:asciiTheme="minorHAnsi" w:hAnsiTheme="minorHAnsi" w:cstheme="minorHAnsi"/>
-        </w:rPr>
-      </w:pPr>
-      <w:bookmarkStart w:id="4" w:name="_Toc241503857"/>
-      <w:r>
-        <w:rPr>
-          <w:rFonts w:asciiTheme="minorHAnsi" w:hAnsiTheme="minorHAnsi" w:cstheme="minorHAnsi"/>
-        </w:rPr>
         <w:t>¿Cuál es el problema?</w:t>
       </w:r>
-      <w:bookmarkEnd w:id="4"/>
     </w:p>
     <w:p>
       <w:r>
-        <w:t>Expresar de manera concisa cual es el quiebre o problema a trabajar.  Establecer claramente cual es la situación actual y por qué representa un problema u oportunidad de mejora.</w:t>
+        <w:t>El proyecto aborda el registro tardío y fragmentado de inspecciones cuando falla la conexión en faenas mineras y obras de construcción en Chile. Afecta a trabajadores y supervisores que necesitan conservar evidencia y conocer su autor. La demo permite capturar localmente y centralizar después. El contexto es simulado con empresas ficticias; no se atribuye una mejora porcentual ni una validación con una organización real.</w:t>
       </w:r>
     </w:p>
     <w:p>
       <w:pPr>
         <w:pStyle w:val="Ttulo2"/>
       </w:pPr>
-      <w:bookmarkStart w:id="5" w:name="_Toc241503858"/>
       <w:r>
         <w:t>Usuarios</w:t>
       </w:r>
-      <w:bookmarkEnd w:id="5"/>
     </w:p>
     <w:p>
       <w:pPr>
         <w:pStyle w:val="Ttulo3"/>
       </w:pPr>
-      <w:bookmarkStart w:id="6" w:name="_Toc241503859"/>
       <w:r>
-        <w:t>Usuario 1</w:t>
+        <w:t>Trabajador de terreno</w:t>
       </w:r>
-      <w:bookmarkEnd w:id="6"/>
     </w:p>
     <w:p>
       <w:pPr>
@@ -2529,54 +1083,30 @@
       </w:r>
     </w:p>
     <w:p>
-      <w:pPr>
-        <w:rPr>
-          <w:lang w:val="es-ES" w:eastAsia="es-ES"/>
-        </w:rPr>
-      </w:pPr>
       <w:r>
-        <w:rPr>
-          <w:lang w:val="es-ES" w:eastAsia="es-ES"/>
-        </w:rPr>
-        <w:t>Detalle del conjunto demográfico o especifico que define el conjunto de usuarios agrupado a este punto.</w:t>
+        <w:t>Personal que realiza inspecciones de faena u obra.</w:t>
       </w:r>
     </w:p>
     <w:p>
       <w:pPr>
         <w:pStyle w:val="Ttulo4"/>
-        <w:rPr>
-          <w:lang w:val="es-ES" w:eastAsia="es-ES"/>
-        </w:rPr>
       </w:pPr>
       <w:r>
-        <w:rPr>
-          <w:lang w:val="es-ES" w:eastAsia="es-ES"/>
-        </w:rPr>
         <w:t>Necesidades de los usuarios</w:t>
       </w:r>
     </w:p>
     <w:p>
-      <w:pPr>
-        <w:rPr>
-          <w:lang w:val="es-ES" w:eastAsia="es-ES"/>
-        </w:rPr>
-      </w:pPr>
       <w:r>
-        <w:rPr>
-          <w:lang w:val="es-ES" w:eastAsia="es-ES"/>
-        </w:rPr>
-        <w:t>Explicitar que problemas o necesidades tiene este conjunto de usuarios.</w:t>
+        <w:t>Elegir su formulario asignado, responder, adjuntar evidencia y continuar sin señal después de la descarga inicial.</w:t>
       </w:r>
     </w:p>
     <w:p>
       <w:pPr>
         <w:pStyle w:val="Ttulo3"/>
       </w:pPr>
-      <w:bookmarkStart w:id="7" w:name="_Toc241503860"/>
       <w:r>
-        <w:t>Usuario 1</w:t>
+        <w:t>Supervisor</w:t>
       </w:r>
-      <w:bookmarkEnd w:id="7"/>
     </w:p>
     <w:p>
       <w:pPr>
@@ -2587,54 +1117,30 @@
       </w:r>
     </w:p>
     <w:p>
-      <w:pPr>
-        <w:rPr>
-          <w:lang w:val="es-ES" w:eastAsia="es-ES"/>
-        </w:rPr>
-      </w:pPr>
       <w:r>
-        <w:rPr>
-          <w:lang w:val="es-ES" w:eastAsia="es-ES"/>
-        </w:rPr>
-        <w:t>Detalle del conjunto demográfico o especifico que define el conjunto de usuarios agrupado a este punto.</w:t>
+        <w:t>Responsable que consulta el estado de las inspecciones de su empresa.</w:t>
       </w:r>
     </w:p>
     <w:p>
       <w:pPr>
         <w:pStyle w:val="Ttulo4"/>
-        <w:rPr>
-          <w:lang w:val="es-ES" w:eastAsia="es-ES"/>
-        </w:rPr>
       </w:pPr>
       <w:r>
-        <w:rPr>
-          <w:lang w:val="es-ES" w:eastAsia="es-ES"/>
-        </w:rPr>
         <w:t>Necesidades de los usuarios</w:t>
       </w:r>
     </w:p>
     <w:p>
-      <w:pPr>
-        <w:rPr>
-          <w:lang w:val="es-ES" w:eastAsia="es-ES"/>
-        </w:rPr>
-      </w:pPr>
       <w:r>
-        <w:rPr>
-          <w:lang w:val="es-ES" w:eastAsia="es-ES"/>
-        </w:rPr>
-        <w:t>Explicitar que problemas o necesidades tiene este conjunto de usuarios.</w:t>
+        <w:t>Identificar al trabajador, revisar respuestas y evidencia, exportar inspecciones y consultar hallazgos o conflictos.</w:t>
       </w:r>
     </w:p>
     <w:p>
       <w:pPr>
         <w:pStyle w:val="Ttulo3"/>
       </w:pPr>
-      <w:bookmarkStart w:id="8" w:name="_Toc241503861"/>
       <w:r>
-        <w:t>Usuario 1</w:t>
+        <w:t>Administrador de empresa y de plataforma</w:t>
       </w:r>
-      <w:bookmarkEnd w:id="8"/>
     </w:p>
     <w:p>
       <w:pPr>
@@ -2645,92 +1151,44 @@
       </w:r>
     </w:p>
     <w:p>
-      <w:pPr>
-        <w:rPr>
-          <w:lang w:val="es-ES" w:eastAsia="es-ES"/>
-        </w:rPr>
-      </w:pPr>
       <w:r>
-        <w:rPr>
-          <w:lang w:val="es-ES" w:eastAsia="es-ES"/>
-        </w:rPr>
-        <w:t>Detalle del conjunto demográfico o especifico que define el conjunto de usuarios agrupado a este punto.</w:t>
+        <w:t>El administrador de empresa gestiona sus plantillas y usuarios. El de plataforma opera empresas mediante permisos globales separados.</w:t>
       </w:r>
     </w:p>
     <w:p>
       <w:pPr>
         <w:pStyle w:val="Ttulo4"/>
-        <w:rPr>
-          <w:lang w:val="es-ES" w:eastAsia="es-ES"/>
-        </w:rPr>
       </w:pPr>
       <w:r>
-        <w:rPr>
-          <w:lang w:val="es-ES" w:eastAsia="es-ES"/>
-        </w:rPr>
         <w:t>Necesidades de los usuarios</w:t>
       </w:r>
     </w:p>
     <w:p>
-      <w:pPr>
-        <w:rPr>
-          <w:lang w:val="es-ES" w:eastAsia="es-ES"/>
-        </w:rPr>
-      </w:pPr>
       <w:r>
-        <w:rPr>
-          <w:lang w:val="es-ES" w:eastAsia="es-ES"/>
-        </w:rPr>
-        <w:t>Explicitar que problemas o necesidades tiene este conjunto de usuarios.</w:t>
+        <w:t>Publicar revisiones, administrar asignaciones por faena y rol y proteger la separación de datos.</w:t>
       </w:r>
     </w:p>
     <w:p>
       <w:pPr>
-        <w:rPr>
-          <w:lang w:val="es-ES" w:eastAsia="es-ES"/>
-        </w:rPr>
-      </w:pPr>
-    </w:p>
-    <w:p>
-      <w:pPr>
         <w:pStyle w:val="Ttulo2"/>
-        <w:rPr>
-          <w:lang w:val="es-ES" w:eastAsia="es-ES"/>
-        </w:rPr>
-      </w:pPr>
-      <w:bookmarkStart w:id="9" w:name="_Toc241503862"/>
+      </w:pPr>
       <w:r>
-        <w:rPr>
-          <w:lang w:val="es-ES" w:eastAsia="es-ES"/>
-        </w:rPr>
         <w:t>Propuesta de Valor</w:t>
-      </w:r>
-      <w:bookmarkEnd w:id="9"/>
-    </w:p>
-    <w:p>
-      <w:pPr>
-        <w:rPr>
-          <w:lang w:val="es-ES" w:eastAsia="es-ES"/>
-        </w:rPr>
-      </w:pPr>
-      <w:r>
-        <w:rPr>
-          <w:lang w:val="es-ES" w:eastAsia="es-ES"/>
-        </w:rPr>
-        <w:t>Señalar como el producto o solución recoge las problemáticas de los diferentes usuarios y establece un resultado el cual aportará un mayor valor (numérico) que la situación actual.</w:t>
       </w:r>
     </w:p>
     <w:p>
-      <w:pPr>
-        <w:rPr>
-          <w:lang w:val="es-ES" w:eastAsia="es-ES"/>
-        </w:rPr>
-      </w:pPr>
       <w:r>
-        <w:rPr>
-          <w:lang w:val="es-ES" w:eastAsia="es-ES"/>
-        </w:rPr>
-        <w:br w:type="page"/>
+        <w:t>Conservar el registro en el dispositivo y enviarlo posteriormente reduce la necesidad de transcribirlo otra vez. La propuesta se demuestra mediante una cola persistente, identificación del autor y exportación. El valor medido al corte es técnico: 401 pruebas de CI, 2 E2E dirigidos y recuperación de DB y archivos comprobada. No existe una línea base de faena que permita atribuir ahorro de horas o una reducción porcentual de errores.</w:t>
+      </w:r>
+    </w:p>
+    <w:p>
+      <w:r>
+        <w:t>Alcance V1: captura, sincronización, formularios Excel, asignaciones y supervisión multiempresa. Fuera de este corte: OCR/IA, aplicación nativa, certificación productiva y medición de impacto operacional.</w:t>
+      </w:r>
+    </w:p>
+    <w:p>
+      <w:r>
+        <w:t>Demo: https://terreno-conectado-demo.duckdns.org/</w:t>
       </w:r>
     </w:p>
     <w:sectPr>
@@ -2742,6 +1200,7 @@
       <w:cols w:space="708"/>
       <w:titlePg/>
       <w:docGrid w:linePitch="360"/>
+      <w:pgNumType w:start="1"/>
     </w:sectPr>
   </w:body>
 </w:document>
@@ -4851,6 +3310,14 @@
     <w:name w:val="Normal"/>
     <w:qFormat/>
     <w:rsid w:val="001F6FE1"/>
+    <w:pPr>
+      <w:spacing w:line="240" w:lineRule="auto"/>
+    </w:pPr>
+    <w:rPr>
+      <w:rFonts w:ascii="Arial" w:hAnsi="Arial"/>
+      <w:color w:val="000000"/>
+      <w:sz w:val="22"/>
+    </w:rPr>
   </w:style>
   <w:style w:type="paragraph" w:styleId="Ttulo1">
     <w:name w:val="heading 1"/>
@@ -4869,10 +3336,10 @@
       <w:outlineLvl w:val="0"/>
     </w:pPr>
     <w:rPr>
-      <w:rFonts w:asciiTheme="majorHAnsi" w:eastAsiaTheme="majorEastAsia" w:hAnsiTheme="majorHAnsi" w:cstheme="majorBidi"/>
+      <w:rFonts w:asciiTheme="majorHAnsi" w:eastAsiaTheme="majorEastAsia" w:hAnsiTheme="majorHAnsi" w:cstheme="majorBidi" w:ascii="Arial" w:hAnsi="Arial"/>
       <w:b/>
       <w:bCs/>
-      <w:color w:val="365F91" w:themeColor="accent1" w:themeShade="BF"/>
+      <w:color w:val="000000"/>
       <w:sz w:val="32"/>
       <w:szCs w:val="28"/>
     </w:rPr>
@@ -4896,10 +3363,10 @@
       <w:outlineLvl w:val="1"/>
     </w:pPr>
     <w:rPr>
-      <w:rFonts w:asciiTheme="majorHAnsi" w:eastAsiaTheme="majorEastAsia" w:hAnsiTheme="majorHAnsi" w:cstheme="majorBidi"/>
+      <w:rFonts w:asciiTheme="majorHAnsi" w:eastAsiaTheme="majorEastAsia" w:hAnsiTheme="majorHAnsi" w:cstheme="majorBidi" w:ascii="Arial" w:hAnsi="Arial"/>
       <w:b/>
       <w:bCs/>
-      <w:color w:val="4F81BD" w:themeColor="accent1"/>
+      <w:color w:val="000000"/>
       <w:sz w:val="26"/>
       <w:szCs w:val="26"/>
     </w:rPr>
@@ -4922,10 +3389,10 @@
       <w:outlineLvl w:val="2"/>
     </w:pPr>
     <w:rPr>
-      <w:rFonts w:asciiTheme="majorHAnsi" w:eastAsia="Times New Roman" w:hAnsiTheme="majorHAnsi" w:cs="Arial"/>
+      <w:rFonts w:asciiTheme="majorHAnsi" w:eastAsia="Times New Roman" w:hAnsiTheme="majorHAnsi" w:cs="Arial" w:ascii="Arial" w:hAnsi="Arial"/>
       <w:b/>
       <w:bCs/>
-      <w:color w:val="548DD4" w:themeColor="text2" w:themeTint="99"/>
+      <w:color w:val="000000"/>
       <w:sz w:val="26"/>
       <w:szCs w:val="26"/>
       <w:lang w:val="es-ES" w:eastAsia="es-ES"/>
@@ -4951,10 +3418,10 @@
       <w:outlineLvl w:val="3"/>
     </w:pPr>
     <w:rPr>
-      <w:rFonts w:asciiTheme="majorHAnsi" w:eastAsiaTheme="majorEastAsia" w:hAnsiTheme="majorHAnsi" w:cstheme="majorBidi"/>
+      <w:rFonts w:asciiTheme="majorHAnsi" w:eastAsiaTheme="majorEastAsia" w:hAnsiTheme="majorHAnsi" w:cstheme="majorBidi" w:ascii="Arial" w:hAnsi="Arial"/>
       <w:i/>
       <w:iCs/>
-      <w:color w:val="365F91" w:themeColor="accent1" w:themeShade="BF"/>
+      <w:color w:val="000000"/>
     </w:rPr>
   </w:style>
   <w:style w:type="paragraph" w:styleId="Ttulo5">
@@ -5396,9 +3863,15 @@
     <w:qFormat/>
     <w:rsid w:val="002E3F8E"/>
     <w:pPr>
+      <w:spacing w:line="240" w:lineRule="auto"/>
       <w:ind w:left="720"/>
       <w:contextualSpacing/>
     </w:pPr>
+    <w:rPr>
+      <w:rFonts w:ascii="Arial" w:hAnsi="Arial"/>
+      <w:color w:val="000000"/>
+      <w:sz w:val="22"/>
+    </w:rPr>
   </w:style>
   <w:style w:type="paragraph" w:styleId="TDC3">
     <w:name w:val="toc 3"/>
@@ -5673,6 +4146,17 @@
       <w:color w:val="272727" w:themeColor="text1" w:themeTint="D8"/>
       <w:sz w:val="21"/>
       <w:szCs w:val="21"/>
+    </w:rPr>
+  </w:style>
+  <w:style w:type="paragraph" w:customStyle="1" w:styleId="ListBullet">
+    <w:name w:val="List Bullet"/>
+    <w:basedOn w:val="Normal"/>
+    <w:pPr>
+      <w:spacing w:after="100"/>
+    </w:pPr>
+    <w:rPr>
+      <w:rFonts w:ascii="Arial" w:hAnsi="Arial"/>
+      <w:sz w:val="22"/>
     </w:rPr>
   </w:style>
 </w:styles>
@@ -6635,7 +5119,7 @@
 <file path=customXml/item1.xml><?xml version="1.0" encoding="utf-8"?>
 <CoverPageProperties xmlns="http://schemas.microsoft.com/office/2006/coverPageProps">
   <PublishDate/>
-  <Abstract>Planificación y Especificación de Requisitos según estándares; IEEE 830, ISO9000 y PMI.</Abstract>
+  <Abstract>Fase 2. Evidencia de proyecto ágil.</Abstract>
   <CompanyAddress/>
   <CompanyPhone/>
   <CompanyFax/>
@@ -6644,7 +5128,6 @@
 </file>
 
 <file path=customXml/item2.xml><?xml version="1.0" encoding="utf-8"?>
-<?mso-contentType ?>
 <FormTemplates xmlns="http://schemas.microsoft.com/sharepoint/v3/contenttype/forms">
   <Display>DocumentLibraryForm</Display>
   <Edit>DocumentLibraryForm</Edit>

</xml_diff>